<commit_message>
fix(reference): update AGENTS.md and reference.docx for formatting
</commit_message>
<xml_diff>
--- a/backend/agent/workspace/reference.docx
+++ b/backend/agent/workspace/reference.docx
@@ -5,27 +5,43 @@
     <w:p>
       <w:pPr>
         <w:pStyle w:val="10"/>
-      </w:pPr>
-      <w:r>
+        <w:rPr>
+          <w:lang w:eastAsia="zh-CN"/>
+        </w:rPr>
+      </w:pPr>
+      <w:r>
+        <w:rPr>
+          <w:lang w:eastAsia="zh-CN"/>
+        </w:rPr>
         <w:t>​​</w:t>
       </w:r>
       <w:bookmarkStart w:id="0" w:name="样式预览"/>
       <w:r>
+        <w:rPr>
+          <w:lang w:eastAsia="zh-CN"/>
+        </w:rPr>
         <w:t>样式预览</w:t>
       </w:r>
     </w:p>
     <w:p>
       <w:pPr>
-        <w:pStyle w:val="2"/>
+        <w:pStyle w:val="20"/>
+        <w:rPr>
+          <w:lang w:eastAsia="zh-CN"/>
+        </w:rPr>
       </w:pPr>
       <w:bookmarkStart w:id="1" w:name="标题样式预览"/>
       <w:r>
+        <w:rPr>
+          <w:lang w:eastAsia="zh-CN"/>
+        </w:rPr>
         <w:t>标题样式预览</w:t>
       </w:r>
     </w:p>
     <w:p>
       <w:pPr>
         <w:pStyle w:val="FirstParagraph"/>
+        <w:ind w:firstLine="480"/>
       </w:pPr>
       <w:r>
         <w:t>上面是二级标题，个人使用情况是一般二级标题作为最大标题层级，一级标题通常情况下只当作文档名，对于特别正式的文稿，会使用一级标题用于大章节划分。</w:t>
@@ -34,50 +50,84 @@
     <w:p>
       <w:pPr>
         <w:pStyle w:val="a0"/>
-      </w:pPr>
-      <w:r>
-        <w:t>本模板标题自动编号</w:t>
+        <w:ind w:firstLine="480"/>
+      </w:pPr>
+      <w:r>
+        <w:t>本模板标题</w:t>
+      </w:r>
+      <w:r>
+        <w:rPr>
+          <w:rFonts w:hint="eastAsia"/>
+        </w:rPr>
+        <w:t>不</w:t>
+      </w:r>
+      <w:r>
+        <w:t>自动编号</w:t>
       </w:r>
     </w:p>
     <w:p>
       <w:pPr>
         <w:pStyle w:val="3"/>
+        <w:rPr>
+          <w:lang w:eastAsia="zh-CN"/>
+        </w:rPr>
       </w:pPr>
       <w:bookmarkStart w:id="2" w:name="三级标题"/>
       <w:r>
+        <w:rPr>
+          <w:lang w:eastAsia="zh-CN"/>
+        </w:rPr>
         <w:t>三级标题</w:t>
       </w:r>
     </w:p>
     <w:p>
       <w:pPr>
         <w:pStyle w:val="4"/>
+        <w:rPr>
+          <w:lang w:eastAsia="zh-CN"/>
+        </w:rPr>
       </w:pPr>
       <w:bookmarkStart w:id="3" w:name="四级标题"/>
       <w:r>
+        <w:rPr>
+          <w:lang w:eastAsia="zh-CN"/>
+        </w:rPr>
         <w:t>四级标题</w:t>
       </w:r>
     </w:p>
     <w:p>
       <w:pPr>
         <w:pStyle w:val="5"/>
+        <w:rPr>
+          <w:lang w:eastAsia="zh-CN"/>
+        </w:rPr>
       </w:pPr>
       <w:bookmarkStart w:id="4" w:name="五级标题"/>
       <w:r>
+        <w:rPr>
+          <w:lang w:eastAsia="zh-CN"/>
+        </w:rPr>
         <w:t>五级标题</w:t>
       </w:r>
     </w:p>
     <w:p>
       <w:pPr>
         <w:pStyle w:val="6"/>
+        <w:rPr>
+          <w:lang w:eastAsia="zh-CN"/>
+        </w:rPr>
       </w:pPr>
       <w:bookmarkStart w:id="5" w:name="六级标题"/>
       <w:r>
+        <w:rPr>
+          <w:lang w:eastAsia="zh-CN"/>
+        </w:rPr>
         <w:t>六级标题</w:t>
       </w:r>
     </w:p>
     <w:p>
       <w:pPr>
-        <w:pStyle w:val="2"/>
+        <w:pStyle w:val="20"/>
       </w:pPr>
       <w:bookmarkStart w:id="6" w:name="其他样式"/>
       <w:bookmarkEnd w:id="1"/>
@@ -101,6 +151,7 @@
     <w:p>
       <w:pPr>
         <w:pStyle w:val="FirstParagraph"/>
+        <w:ind w:firstLine="480"/>
       </w:pPr>
       <w:r>
         <w:t>正文样式默认首行缩进，字号小四，中文字体为宋体，英文</w:t>
@@ -112,6 +163,7 @@
     <w:p>
       <w:pPr>
         <w:pStyle w:val="a0"/>
+        <w:ind w:firstLine="480"/>
       </w:pPr>
       <w:r>
         <w:t>页脚自动添加了页码</w:t>
@@ -120,6 +172,7 @@
     <w:p>
       <w:pPr>
         <w:pStyle w:val="a0"/>
+        <w:ind w:firstLine="480"/>
       </w:pPr>
       <w:r>
         <w:rPr>
@@ -131,7 +184,7 @@
         <w:fldChar w:fldCharType="begin"/>
       </w:r>
       <w:r>
-        <w:instrText xml:space="preserve"> ADDIN ZOTERO_ITEM CSL_CITATION {"citationID":"cyBLairJ","properties":{"formattedCitation":"\\super [1]\\nosupersub{}","plainCitation":"[1]","noteIndex":0},"citationItems":[{"id":30,"uris":["http://zotero.org/users/8830829/items/Q93SUFL4"],"itemData":{"id":30,"type":"book","abstract":"\"Neuroscience: Exploring the Brain surveys the organization and function of the human nervous system. We present material at the cutting edge of neuroscience in a way that is accessible to both science and nonscience students alike. The level of the material is comparable to an introductory college text in general biology. The book is divided into four parts: Part I, Foundations; Part II, Sensory and Motor Systems; Part III, The Brain and Behavior; and Part IV, The Changing Brain. We begin Part I by introducing the modern field of neuroscience and tracing some of its historical antecedents. Then we take a close look at the structure and function of individual neurons, how they communicate chemically, and how these building blocks are arranged to form a nervous system. In Part II, we go inside the brain to examine the structure and function of the systems that serve the senses and command voluntary movements. In Part III, we explore the neurobiology of human behavior, including motivation, sex, emotion, sleep, language, attention, and mental illness. Finally, in Part IV, we look at how the environment modifies the brain, both during development and in adult learning and memory\"--Provided by publisher","call-number":"QP355.2 .B42 2016","edition":"Fourth edition","event-place":"Philadelphia","ISBN":"978-0-7817-7817-6","language":"en-US","note":"rate: 5","number-of-pages":"975","publisher":"Wolters Kluwer","publisher-place":"Philadelphia","source":"Library of Congress ISBN","title":"Neuroscience: exploring the brain (Fourth edition)","title-short":"Neuroscience","author":[{"family":"Bear","given":"Mark F."},{"family":"Connors","given":"Barry W."},{"family":"Paradiso","given":"Michael A."}],"issued":{"date-parts":[["2016"]]}}}],"schema":"https://github.com/citation-style-language/schema/raw/master/csl-citation.json"} </w:instrText>
+        <w:instrText xml:space="preserve"> ADDIN ZOTERO_ITEM CSL_CITATION {"citationID":"N8JHR6Uj","properties":{"formattedCitation":"\\super [1]\\nosupersub{}","plainCitation":"[1]","noteIndex":0},"citationItems":[{"id":30,"uris":["http://zotero.org/users/8830829/items/Q93SUFL4"],"itemData":{"id":30,"type":"book","abstract":"\"Neuroscience: Exploring the Brain surveys the organization and function of the human nervous system. We present material at the cutting edge of neuroscience in a way that is accessible to both science and nonscience students alike. The level of the material is comparable to an introductory college text in general biology. The book is divided into four parts: Part I, Foundations; Part II, Sensory and Motor Systems; Part III, The Brain and Behavior; and Part IV, The Changing Brain. We begin Part I by introducing the modern field of neuroscience and tracing some of its historical antecedents. Then we take a close look at the structure and function of individual neurons, how they communicate chemically, and how these building blocks are arranged to form a nervous system. In Part II, we go inside the brain to examine the structure and function of the systems that serve the senses and command voluntary movements. In Part III, we explore the neurobiology of human behavior, including motivation, sex, emotion, sleep, language, attention, and mental illness. Finally, in Part IV, we look at how the environment modifies the brain, both during development and in adult learning and memory\"--Provided by publisher","call-number":"QP355.2 .B42 2016","edition":"Fourth edition","event-place":"Philadelphia","ISBN":"978-0-7817-7817-6","language":"en-US","note":"rate: 5","number-of-pages":"975","publisher":"Wolters Kluwer","publisher-place":"Philadelphia","source":"Library of Congress ISBN","title":"Neuroscience: exploring the brain (Fourth edition)","title-short":"Neuroscience","author":[{"family":"Bear","given":"Mark F."},{"family":"Connors","given":"Barry W."},{"family":"Paradiso","given":"Michael A."}],"issued":{"date-parts":[["2016"]]}}}],"schema":"https://github.com/citation-style-language/schema/raw/master/csl-citation.json"} </w:instrText>
       </w:r>
       <w:r>
         <w:fldChar w:fldCharType="separate"/>
@@ -150,24 +203,18 @@
     <w:p>
       <w:pPr>
         <w:pStyle w:val="a8"/>
-        <w:ind w:left="420" w:hanging="420"/>
+        <w:ind w:left="480" w:hanging="480"/>
         <w:rPr>
           <w:rFonts w:cs="Times New Roman"/>
         </w:rPr>
       </w:pPr>
       <w:r>
-        <w:rPr>
-          <w:sz w:val="21"/>
-        </w:rPr>
         <w:fldChar w:fldCharType="begin"/>
       </w:r>
       <w:r>
         <w:instrText xml:space="preserve"> ADDIN ZOTERO_BIBL {"uncited":[],"omitted":[],"custom":[]} CSL_BIBLIOGRAPHY </w:instrText>
       </w:r>
       <w:r>
-        <w:rPr>
-          <w:sz w:val="21"/>
-        </w:rPr>
         <w:fldChar w:fldCharType="separate"/>
       </w:r>
       <w:r>
@@ -187,6 +234,7 @@
     <w:p>
       <w:pPr>
         <w:pStyle w:val="a0"/>
+        <w:ind w:firstLine="480"/>
       </w:pPr>
       <w:r>
         <w:fldChar w:fldCharType="end"/>
@@ -194,11 +242,23 @@
     </w:p>
     <w:p>
       <w:pPr>
+        <w:pStyle w:val="a0"/>
+        <w:ind w:firstLine="480"/>
+      </w:pPr>
+    </w:p>
+    <w:p>
+      <w:pPr>
         <w:pStyle w:val="3"/>
+        <w:rPr>
+          <w:lang w:eastAsia="zh-CN"/>
+        </w:rPr>
       </w:pPr>
       <w:bookmarkStart w:id="8" w:name="列表"/>
       <w:bookmarkEnd w:id="7"/>
       <w:r>
+        <w:rPr>
+          <w:lang w:eastAsia="zh-CN"/>
+        </w:rPr>
         <w:lastRenderedPageBreak/>
         <w:t>列表</w:t>
       </w:r>
@@ -206,12 +266,14 @@
     <w:p>
       <w:pPr>
         <w:pStyle w:val="4"/>
-        <w:rPr>
-          <w:lang w:eastAsia="zh-CN"/>
-        </w:rPr>
-      </w:pPr>
-      <w:bookmarkStart w:id="9" w:name="有序列表"/>
-      <w:r>
+      </w:pPr>
+      <w:bookmarkStart w:id="9" w:name="Xc37fb3293d6aee3816a7d458c1d9225e366ee70"/>
+      <w:bookmarkStart w:id="10" w:name="超链接"/>
+      <w:bookmarkEnd w:id="8"/>
+      <w:r>
+        <w:rPr>
+          <w:rFonts w:hint="eastAsia"/>
+        </w:rPr>
         <w:t>有序列表</w:t>
       </w:r>
     </w:p>
@@ -219,13 +281,13 @@
       <w:pPr>
         <w:numPr>
           <w:ilvl w:val="0"/>
-          <w:numId w:val="7"/>
+          <w:numId w:val="6"/>
         </w:numPr>
         <w:rPr>
           <w:lang w:eastAsia="zh-CN"/>
         </w:rPr>
       </w:pPr>
-      <w:bookmarkStart w:id="10" w:name="Xb06ea4422dc9449613ca4b3e132a0d340ca3f13"/>
+      <w:bookmarkStart w:id="11" w:name="Xb06ea4422dc9449613ca4b3e132a0d340ca3f13"/>
       <w:r>
         <w:rPr>
           <w:rFonts w:hint="eastAsia"/>
@@ -247,13 +309,13 @@
       <w:pPr>
         <w:numPr>
           <w:ilvl w:val="1"/>
-          <w:numId w:val="7"/>
+          <w:numId w:val="6"/>
         </w:numPr>
         <w:rPr>
           <w:lang w:eastAsia="zh-CN"/>
         </w:rPr>
       </w:pPr>
-      <w:bookmarkStart w:id="11" w:name="X62883b63c699ec1bf38406f65bf5650ea01bfb3"/>
+      <w:bookmarkStart w:id="12" w:name="X62883b63c699ec1bf38406f65bf5650ea01bfb3"/>
       <w:r>
         <w:rPr>
           <w:rFonts w:hint="eastAsia"/>
@@ -261,9 +323,27 @@
           <w:bCs/>
           <w:lang w:eastAsia="zh-CN"/>
         </w:rPr>
-        <w:t>市场调研</w:t>
-      </w:r>
-      <w:proofErr w:type="gramStart"/>
+        <w:t>市场调研与竞品分析：</w:t>
+      </w:r>
+      <w:r>
+        <w:rPr>
+          <w:rFonts w:hint="eastAsia"/>
+          <w:lang w:eastAsia="zh-CN"/>
+        </w:rPr>
+        <w:t>团队需要搜集市面上同类产品的所有公开信息，包括其功能特性、用户评价、市场占有率以及定价策略。</w:t>
+      </w:r>
+    </w:p>
+    <w:p>
+      <w:pPr>
+        <w:numPr>
+          <w:ilvl w:val="2"/>
+          <w:numId w:val="6"/>
+        </w:numPr>
+        <w:rPr>
+          <w:lang w:eastAsia="zh-CN"/>
+        </w:rPr>
+      </w:pPr>
+      <w:bookmarkStart w:id="13" w:name="X42d8389da79f574f34ed2db43e5d087b6863539"/>
       <w:r>
         <w:rPr>
           <w:rFonts w:hint="eastAsia"/>
@@ -271,9 +351,29 @@
           <w:bCs/>
           <w:lang w:eastAsia="zh-CN"/>
         </w:rPr>
-        <w:t>与竞品分析</w:t>
-      </w:r>
-      <w:proofErr w:type="gramEnd"/>
+        <w:t>数据采集与清洗：</w:t>
+      </w:r>
+      <w:r>
+        <w:rPr>
+          <w:rFonts w:hint="eastAsia"/>
+          <w:lang w:eastAsia="zh-CN"/>
+        </w:rPr>
+        <w:t>利用爬虫工具或购买第三方数据库获取原始数据，并对这些数据进行去重、纠错和标准化处理。</w:t>
+      </w:r>
+    </w:p>
+    <w:p>
+      <w:pPr>
+        <w:numPr>
+          <w:ilvl w:val="1"/>
+          <w:numId w:val="6"/>
+        </w:numPr>
+        <w:rPr>
+          <w:lang w:eastAsia="zh-CN"/>
+        </w:rPr>
+      </w:pPr>
+      <w:bookmarkStart w:id="14" w:name="X1f0e1cf4fdec7b48614d5b92e4349b6c82b56c5"/>
+      <w:bookmarkEnd w:id="12"/>
+      <w:bookmarkEnd w:id="13"/>
       <w:r>
         <w:rPr>
           <w:rFonts w:hint="eastAsia"/>
@@ -281,27 +381,29 @@
           <w:bCs/>
           <w:lang w:eastAsia="zh-CN"/>
         </w:rPr>
-        <w:t>：</w:t>
+        <w:t>技术可行性评估：</w:t>
       </w:r>
       <w:r>
         <w:rPr>
           <w:rFonts w:hint="eastAsia"/>
           <w:lang w:eastAsia="zh-CN"/>
         </w:rPr>
-        <w:t>团队需要搜集市面上同类产品的所有公开信息，包括其功能特性、用户评价、市场占有率以及定价策略。</w:t>
+        <w:t>架构师和资深开发工程师将针对需求文档中的核心技术难点进行预研，评估现有技术栈是否能够满足性能要求。</w:t>
       </w:r>
     </w:p>
     <w:p>
       <w:pPr>
         <w:numPr>
-          <w:ilvl w:val="2"/>
-          <w:numId w:val="7"/>
+          <w:ilvl w:val="0"/>
+          <w:numId w:val="6"/>
         </w:numPr>
         <w:rPr>
           <w:lang w:eastAsia="zh-CN"/>
         </w:rPr>
       </w:pPr>
-      <w:bookmarkStart w:id="12" w:name="X42d8389da79f574f34ed2db43e5d087b6863539"/>
+      <w:bookmarkStart w:id="15" w:name="X1546bc2cd2fbbb4ab0cd6594d4038d6fb7cdfae"/>
+      <w:bookmarkEnd w:id="11"/>
+      <w:bookmarkEnd w:id="14"/>
       <w:r>
         <w:rPr>
           <w:rFonts w:hint="eastAsia"/>
@@ -309,29 +411,61 @@
           <w:bCs/>
           <w:lang w:eastAsia="zh-CN"/>
         </w:rPr>
-        <w:t>数据采集与清洗：</w:t>
+        <w:t>系统设计与架构开发：</w:t>
       </w:r>
       <w:r>
         <w:rPr>
           <w:rFonts w:hint="eastAsia"/>
           <w:lang w:eastAsia="zh-CN"/>
         </w:rPr>
-        <w:t>利用爬虫工具或购买第三方数据库获取原始数据，并对这些数据进行去重、纠错和标准化处理。</w:t>
+        <w:t>在需求明确后，架构师将开始设计系统的整体框架，包括数据库设计、</w:t>
+      </w:r>
+      <w:r>
+        <w:rPr>
+          <w:rFonts w:hint="eastAsia"/>
+          <w:lang w:eastAsia="zh-CN"/>
+        </w:rPr>
+        <w:t>API</w:t>
+      </w:r>
+      <w:r>
+        <w:rPr>
+          <w:lang w:eastAsia="zh-CN"/>
+        </w:rPr>
+        <w:t xml:space="preserve"> </w:t>
+      </w:r>
+      <w:r>
+        <w:rPr>
+          <w:rFonts w:hint="eastAsia"/>
+          <w:lang w:eastAsia="zh-CN"/>
+        </w:rPr>
+        <w:t>接口规范以及微服务拆分方案。</w:t>
+      </w:r>
+    </w:p>
+    <w:p>
+      <w:pPr>
+        <w:pStyle w:val="4"/>
+      </w:pPr>
+      <w:bookmarkStart w:id="16" w:name="X485da3cdc3607fd788ed822705cf7db61c16e9c"/>
+      <w:bookmarkEnd w:id="9"/>
+      <w:bookmarkEnd w:id="15"/>
+      <w:r>
+        <w:rPr>
+          <w:rFonts w:hint="eastAsia"/>
+        </w:rPr>
+        <w:t>无序列表</w:t>
       </w:r>
     </w:p>
     <w:p>
       <w:pPr>
         <w:numPr>
-          <w:ilvl w:val="1"/>
-          <w:numId w:val="7"/>
+          <w:ilvl w:val="0"/>
+          <w:numId w:val="12"/>
         </w:numPr>
         <w:rPr>
           <w:lang w:eastAsia="zh-CN"/>
         </w:rPr>
       </w:pPr>
-      <w:bookmarkStart w:id="13" w:name="X1f0e1cf4fdec7b48614d5b92e4349b6c82b56c5"/>
-      <w:bookmarkEnd w:id="11"/>
-      <w:bookmarkEnd w:id="12"/>
+      <w:bookmarkStart w:id="17" w:name="X6f89e330edf6ff9308603fa67219a7a23ddc333"/>
       <w:r>
         <w:rPr>
           <w:rFonts w:hint="eastAsia"/>
@@ -339,54 +473,27 @@
           <w:bCs/>
           <w:lang w:eastAsia="zh-CN"/>
         </w:rPr>
-        <w:t>技术可行性评估：</w:t>
-      </w:r>
-      <w:proofErr w:type="gramStart"/>
+        <w:t>项目启动与需求分析阶段：</w:t>
+      </w:r>
       <w:r>
         <w:rPr>
           <w:rFonts w:hint="eastAsia"/>
           <w:lang w:eastAsia="zh-CN"/>
         </w:rPr>
-        <w:t>架构师</w:t>
-      </w:r>
-      <w:proofErr w:type="gramEnd"/>
-      <w:r>
-        <w:rPr>
-          <w:rFonts w:hint="eastAsia"/>
-          <w:lang w:eastAsia="zh-CN"/>
-        </w:rPr>
-        <w:t>和资深开发工程师将针对需求文档中的核心技术难点进行预研，评估现有技术</w:t>
-      </w:r>
-      <w:proofErr w:type="gramStart"/>
-      <w:r>
-        <w:rPr>
-          <w:rFonts w:hint="eastAsia"/>
-          <w:lang w:eastAsia="zh-CN"/>
-        </w:rPr>
-        <w:t>栈</w:t>
-      </w:r>
-      <w:proofErr w:type="gramEnd"/>
-      <w:r>
-        <w:rPr>
-          <w:rFonts w:hint="eastAsia"/>
-          <w:lang w:eastAsia="zh-CN"/>
-        </w:rPr>
-        <w:t>是否能够满足性能要求。</w:t>
+        <w:t>这是整个项目的基石。在这一阶段，产品经理需要与客户进行深度沟通，明确业务目标、用户群体以及核心功能点。</w:t>
       </w:r>
     </w:p>
     <w:p>
       <w:pPr>
         <w:numPr>
-          <w:ilvl w:val="0"/>
-          <w:numId w:val="7"/>
+          <w:ilvl w:val="1"/>
+          <w:numId w:val="12"/>
         </w:numPr>
         <w:rPr>
           <w:lang w:eastAsia="zh-CN"/>
         </w:rPr>
       </w:pPr>
-      <w:bookmarkStart w:id="14" w:name="X1546bc2cd2fbbb4ab0cd6594d4038d6fb7cdfae"/>
-      <w:bookmarkEnd w:id="10"/>
-      <w:bookmarkEnd w:id="13"/>
+      <w:bookmarkStart w:id="18" w:name="Xb331877a1d4b55677400be109de78d7b78615ef"/>
       <w:r>
         <w:rPr>
           <w:rFonts w:hint="eastAsia"/>
@@ -394,93 +501,27 @@
           <w:bCs/>
           <w:lang w:eastAsia="zh-CN"/>
         </w:rPr>
-        <w:t>系统设计与架构开发：</w:t>
+        <w:t>市场调研与竞品分析：</w:t>
       </w:r>
       <w:r>
         <w:rPr>
           <w:rFonts w:hint="eastAsia"/>
           <w:lang w:eastAsia="zh-CN"/>
         </w:rPr>
-        <w:t>在需求明确后，</w:t>
-      </w:r>
-      <w:proofErr w:type="gramStart"/>
-      <w:r>
-        <w:rPr>
-          <w:rFonts w:hint="eastAsia"/>
-          <w:lang w:eastAsia="zh-CN"/>
-        </w:rPr>
-        <w:t>架构师</w:t>
-      </w:r>
-      <w:proofErr w:type="gramEnd"/>
-      <w:r>
-        <w:rPr>
-          <w:rFonts w:hint="eastAsia"/>
-          <w:lang w:eastAsia="zh-CN"/>
-        </w:rPr>
-        <w:t>将开始设计系统的整体框架，包括数据库设计、</w:t>
-      </w:r>
-      <w:r>
-        <w:rPr>
-          <w:rFonts w:hint="eastAsia"/>
-          <w:lang w:eastAsia="zh-CN"/>
-        </w:rPr>
-        <w:t>API</w:t>
-      </w:r>
-      <w:r>
-        <w:rPr>
-          <w:lang w:eastAsia="zh-CN"/>
-        </w:rPr>
-        <w:t xml:space="preserve"> </w:t>
-      </w:r>
-      <w:r>
-        <w:rPr>
-          <w:rFonts w:hint="eastAsia"/>
-          <w:lang w:eastAsia="zh-CN"/>
-        </w:rPr>
-        <w:t>接口规范以及</w:t>
-      </w:r>
-      <w:proofErr w:type="gramStart"/>
-      <w:r>
-        <w:rPr>
-          <w:rFonts w:hint="eastAsia"/>
-          <w:lang w:eastAsia="zh-CN"/>
-        </w:rPr>
-        <w:t>微服务</w:t>
-      </w:r>
-      <w:proofErr w:type="gramEnd"/>
-      <w:r>
-        <w:rPr>
-          <w:rFonts w:hint="eastAsia"/>
-          <w:lang w:eastAsia="zh-CN"/>
-        </w:rPr>
-        <w:t>拆分方案。</w:t>
-      </w:r>
-      <w:bookmarkEnd w:id="14"/>
-    </w:p>
-    <w:p>
-      <w:pPr>
-        <w:pStyle w:val="4"/>
-      </w:pPr>
-      <w:bookmarkStart w:id="15" w:name="无序列表"/>
-      <w:bookmarkEnd w:id="9"/>
-      <w:r>
-        <w:t>无序列表</w:t>
+        <w:t>团队需要搜集市面上同类产品的所有公开信息，包括其功能特性、用户评价、市场占有率以及定价策略。</w:t>
       </w:r>
     </w:p>
     <w:p>
       <w:pPr>
         <w:numPr>
-          <w:ilvl w:val="0"/>
-          <w:numId w:val="13"/>
+          <w:ilvl w:val="2"/>
+          <w:numId w:val="12"/>
         </w:numPr>
         <w:rPr>
           <w:lang w:eastAsia="zh-CN"/>
         </w:rPr>
       </w:pPr>
-      <w:bookmarkStart w:id="16" w:name="X6f89e330edf6ff9308603fa67219a7a23ddc333"/>
-      <w:bookmarkStart w:id="17" w:name="代码块和行内代码"/>
-      <w:bookmarkEnd w:id="8"/>
-      <w:bookmarkEnd w:id="15"/>
+      <w:bookmarkStart w:id="19" w:name="X78a6e4095e4aabe0bb33349a8c352bafc2e5c21"/>
       <w:r>
         <w:rPr>
           <w:rFonts w:hint="eastAsia"/>
@@ -488,27 +529,29 @@
           <w:bCs/>
           <w:lang w:eastAsia="zh-CN"/>
         </w:rPr>
-        <w:t>项目启动与需求分析阶段：</w:t>
+        <w:t>数据采集与清洗：</w:t>
       </w:r>
       <w:r>
         <w:rPr>
           <w:rFonts w:hint="eastAsia"/>
           <w:lang w:eastAsia="zh-CN"/>
         </w:rPr>
-        <w:t>这是整个项目的基石。在这一阶段，产品经理需要与客户进行深度沟通，明确业务目标、用户群体以及核心功能点。</w:t>
+        <w:t>利用爬虫工具或购买第三方数据库获取原始数据，并对这些数据进行去重、纠错和标准化处理。</w:t>
       </w:r>
     </w:p>
     <w:p>
       <w:pPr>
         <w:numPr>
           <w:ilvl w:val="1"/>
-          <w:numId w:val="13"/>
+          <w:numId w:val="12"/>
         </w:numPr>
         <w:rPr>
           <w:lang w:eastAsia="zh-CN"/>
         </w:rPr>
       </w:pPr>
-      <w:bookmarkStart w:id="18" w:name="Xb331877a1d4b55677400be109de78d7b78615ef"/>
+      <w:bookmarkStart w:id="20" w:name="X46f38fc1dc58b272e78d51d80fff1757a58b543"/>
+      <w:bookmarkEnd w:id="18"/>
+      <w:bookmarkEnd w:id="19"/>
       <w:r>
         <w:rPr>
           <w:rFonts w:hint="eastAsia"/>
@@ -516,9 +559,29 @@
           <w:bCs/>
           <w:lang w:eastAsia="zh-CN"/>
         </w:rPr>
-        <w:t>市场调研</w:t>
-      </w:r>
-      <w:proofErr w:type="gramStart"/>
+        <w:t>技术可行性评估：</w:t>
+      </w:r>
+      <w:r>
+        <w:rPr>
+          <w:rFonts w:hint="eastAsia"/>
+          <w:lang w:eastAsia="zh-CN"/>
+        </w:rPr>
+        <w:t>架构师和资深开发工程师将针对需求文档中的核心技术难点进行预研，评估现有技术栈是否能够满足性能要求。</w:t>
+      </w:r>
+    </w:p>
+    <w:p>
+      <w:pPr>
+        <w:numPr>
+          <w:ilvl w:val="0"/>
+          <w:numId w:val="12"/>
+        </w:numPr>
+        <w:rPr>
+          <w:lang w:eastAsia="zh-CN"/>
+        </w:rPr>
+      </w:pPr>
+      <w:bookmarkStart w:id="21" w:name="X27268bb71e719023554e4e14efa2bf158cff1d5"/>
+      <w:bookmarkEnd w:id="17"/>
+      <w:bookmarkEnd w:id="20"/>
       <w:r>
         <w:rPr>
           <w:rFonts w:hint="eastAsia"/>
@@ -526,191 +589,38 @@
           <w:bCs/>
           <w:lang w:eastAsia="zh-CN"/>
         </w:rPr>
-        <w:t>与竞品分析</w:t>
-      </w:r>
-      <w:proofErr w:type="gramEnd"/>
+        <w:t>系统设计与架构开发：</w:t>
+      </w:r>
       <w:r>
         <w:rPr>
           <w:rFonts w:hint="eastAsia"/>
-          <w:b/>
-          <w:bCs/>
-          <w:lang w:eastAsia="zh-CN"/>
-        </w:rPr>
-        <w:t>：</w:t>
+          <w:lang w:eastAsia="zh-CN"/>
+        </w:rPr>
+        <w:t>在需求明确后，架构师将开始设计系统的整体框架，包括数据库设计、</w:t>
       </w:r>
       <w:r>
         <w:rPr>
           <w:rFonts w:hint="eastAsia"/>
           <w:lang w:eastAsia="zh-CN"/>
         </w:rPr>
-        <w:t>团队需要搜集市面上同类产品的所有公开信息，包括其功能特性、用户评价、市场占有率以及定价策略。</w:t>
-      </w:r>
-    </w:p>
-    <w:p>
-      <w:pPr>
-        <w:numPr>
-          <w:ilvl w:val="2"/>
-          <w:numId w:val="13"/>
-        </w:numPr>
-        <w:rPr>
-          <w:lang w:eastAsia="zh-CN"/>
-        </w:rPr>
-      </w:pPr>
-      <w:bookmarkStart w:id="19" w:name="X78a6e4095e4aabe0bb33349a8c352bafc2e5c21"/>
+        <w:t>API</w:t>
+      </w:r>
+      <w:r>
+        <w:rPr>
+          <w:lang w:eastAsia="zh-CN"/>
+        </w:rPr>
+        <w:t xml:space="preserve"> </w:t>
+      </w:r>
       <w:r>
         <w:rPr>
           <w:rFonts w:hint="eastAsia"/>
-          <w:b/>
-          <w:bCs/>
-          <w:lang w:eastAsia="zh-CN"/>
-        </w:rPr>
-        <w:t>数据采集与清洗：</w:t>
-      </w:r>
-      <w:r>
-        <w:rPr>
-          <w:rFonts w:hint="eastAsia"/>
-          <w:lang w:eastAsia="zh-CN"/>
-        </w:rPr>
-        <w:t>利用爬虫工具或购买第三方数据库获取原始数据，并对这些数据进行去重、纠错和标准化处理。</w:t>
-      </w:r>
-    </w:p>
-    <w:p>
-      <w:pPr>
-        <w:numPr>
-          <w:ilvl w:val="1"/>
-          <w:numId w:val="13"/>
-        </w:numPr>
-        <w:rPr>
-          <w:lang w:eastAsia="zh-CN"/>
-        </w:rPr>
-      </w:pPr>
-      <w:bookmarkStart w:id="20" w:name="X46f38fc1dc58b272e78d51d80fff1757a58b543"/>
-      <w:bookmarkEnd w:id="18"/>
-      <w:bookmarkEnd w:id="19"/>
-      <w:r>
-        <w:rPr>
-          <w:rFonts w:hint="eastAsia"/>
-          <w:b/>
-          <w:bCs/>
-          <w:lang w:eastAsia="zh-CN"/>
-        </w:rPr>
-        <w:t>技术可行性评估：</w:t>
-      </w:r>
-      <w:proofErr w:type="gramStart"/>
-      <w:r>
-        <w:rPr>
-          <w:rFonts w:hint="eastAsia"/>
-          <w:lang w:eastAsia="zh-CN"/>
-        </w:rPr>
-        <w:t>架构师</w:t>
-      </w:r>
-      <w:proofErr w:type="gramEnd"/>
-      <w:r>
-        <w:rPr>
-          <w:rFonts w:hint="eastAsia"/>
-          <w:lang w:eastAsia="zh-CN"/>
-        </w:rPr>
-        <w:t>和资深开发工程师将针对需求文档中的核心技术难点进行预研，评估现有技术</w:t>
-      </w:r>
-      <w:proofErr w:type="gramStart"/>
-      <w:r>
-        <w:rPr>
-          <w:rFonts w:hint="eastAsia"/>
-          <w:lang w:eastAsia="zh-CN"/>
-        </w:rPr>
-        <w:t>栈</w:t>
-      </w:r>
-      <w:proofErr w:type="gramEnd"/>
-      <w:r>
-        <w:rPr>
-          <w:rFonts w:hint="eastAsia"/>
-          <w:lang w:eastAsia="zh-CN"/>
-        </w:rPr>
-        <w:t>是否能够满足性能要求。</w:t>
-      </w:r>
-    </w:p>
-    <w:p>
-      <w:pPr>
-        <w:numPr>
-          <w:ilvl w:val="0"/>
-          <w:numId w:val="13"/>
-        </w:numPr>
-        <w:rPr>
-          <w:lang w:eastAsia="zh-CN"/>
-        </w:rPr>
-      </w:pPr>
-      <w:bookmarkStart w:id="21" w:name="X27268bb71e719023554e4e14efa2bf158cff1d5"/>
-      <w:bookmarkEnd w:id="16"/>
-      <w:bookmarkEnd w:id="20"/>
-      <w:r>
-        <w:rPr>
-          <w:rFonts w:hint="eastAsia"/>
-          <w:b/>
-          <w:bCs/>
-          <w:lang w:eastAsia="zh-CN"/>
-        </w:rPr>
-        <w:t>系统设计与架构开发：</w:t>
-      </w:r>
-      <w:r>
-        <w:rPr>
-          <w:rFonts w:hint="eastAsia"/>
-          <w:lang w:eastAsia="zh-CN"/>
-        </w:rPr>
-        <w:t>在需求明确后，</w:t>
-      </w:r>
-      <w:proofErr w:type="gramStart"/>
-      <w:r>
-        <w:rPr>
-          <w:rFonts w:hint="eastAsia"/>
-          <w:lang w:eastAsia="zh-CN"/>
-        </w:rPr>
-        <w:t>架构师</w:t>
-      </w:r>
-      <w:proofErr w:type="gramEnd"/>
-      <w:r>
-        <w:rPr>
-          <w:rFonts w:hint="eastAsia"/>
-          <w:lang w:eastAsia="zh-CN"/>
-        </w:rPr>
-        <w:t>将开始设计系统的整体框架，包括数据库设计、</w:t>
-      </w:r>
-      <w:r>
-        <w:rPr>
-          <w:rFonts w:hint="eastAsia"/>
-          <w:lang w:eastAsia="zh-CN"/>
-        </w:rPr>
-        <w:t>API</w:t>
-      </w:r>
-      <w:r>
-        <w:rPr>
-          <w:lang w:eastAsia="zh-CN"/>
-        </w:rPr>
-        <w:t xml:space="preserve"> </w:t>
-      </w:r>
-      <w:r>
-        <w:rPr>
-          <w:rFonts w:hint="eastAsia"/>
-          <w:lang w:eastAsia="zh-CN"/>
-        </w:rPr>
-        <w:t>接口规范以及</w:t>
-      </w:r>
-      <w:proofErr w:type="gramStart"/>
-      <w:r>
-        <w:rPr>
-          <w:rFonts w:hint="eastAsia"/>
-          <w:lang w:eastAsia="zh-CN"/>
-        </w:rPr>
-        <w:t>微服务</w:t>
-      </w:r>
-      <w:proofErr w:type="gramEnd"/>
-      <w:r>
-        <w:rPr>
-          <w:rFonts w:hint="eastAsia"/>
-          <w:lang w:eastAsia="zh-CN"/>
-        </w:rPr>
-        <w:t>拆分方案。</w:t>
-      </w:r>
-    </w:p>
+          <w:lang w:eastAsia="zh-CN"/>
+        </w:rPr>
+        <w:t>接口规范以及微服务拆分方案。</w:t>
+      </w:r>
+    </w:p>
+    <w:bookmarkEnd w:id="16"/>
+    <w:bookmarkEnd w:id="21"/>
     <w:p>
       <w:pPr>
         <w:pStyle w:val="3"/>
@@ -720,7 +630,6 @@
       </w:pPr>
       <w:r>
         <w:rPr>
-          <w:rFonts w:hint="eastAsia"/>
           <w:lang w:eastAsia="zh-CN"/>
         </w:rPr>
         <w:t>超链接</w:t>
@@ -729,6 +638,7 @@
     <w:p>
       <w:pPr>
         <w:pStyle w:val="FirstParagraph"/>
+        <w:ind w:firstLine="480"/>
       </w:pPr>
       <w:hyperlink r:id="rId8">
         <w:r>
@@ -737,22 +647,27 @@
           </w:rPr>
           <w:t>Achuan-2</w:t>
         </w:r>
-        <w:proofErr w:type="gramStart"/>
         <w:r>
           <w:rPr>
             <w:rStyle w:val="ae"/>
           </w:rPr>
           <w:t>的博客</w:t>
         </w:r>
-        <w:proofErr w:type="gramEnd"/>
       </w:hyperlink>
     </w:p>
-    <w:bookmarkEnd w:id="21"/>
     <w:p>
       <w:pPr>
         <w:pStyle w:val="3"/>
-      </w:pPr>
-      <w:r>
+        <w:rPr>
+          <w:lang w:eastAsia="zh-CN"/>
+        </w:rPr>
+      </w:pPr>
+      <w:bookmarkStart w:id="22" w:name="代码块和行内代码"/>
+      <w:bookmarkEnd w:id="10"/>
+      <w:r>
+        <w:rPr>
+          <w:lang w:eastAsia="zh-CN"/>
+        </w:rPr>
         <w:lastRenderedPageBreak/>
         <w:t>代码块和行内代码</w:t>
       </w:r>
@@ -760,11 +675,10 @@
     <w:p>
       <w:pPr>
         <w:pStyle w:val="FirstParagraph"/>
-      </w:pPr>
-      <w:bookmarkStart w:id="22" w:name="表格"/>
-      <w:bookmarkEnd w:id="17"/>
-      <w:r>
-        <w:t>代码块添加底纹和边缘细边框</w:t>
+        <w:ind w:firstLine="480"/>
+      </w:pPr>
+      <w:r>
+        <w:t>代码块添加边框</w:t>
       </w:r>
     </w:p>
     <w:p>
@@ -854,7 +768,6 @@
         </w:rPr>
         <w:t>(</w:t>
       </w:r>
-      <w:proofErr w:type="gramStart"/>
       <w:r>
         <w:rPr>
           <w:rFonts w:ascii="Consolas" w:eastAsiaTheme="minorEastAsia" w:hAnsi="Consolas"/>
@@ -883,9 +796,18 @@
           <w:shd w:val="clear" w:color="auto" w:fill="auto"/>
           <w:lang w:eastAsia="en-US"/>
         </w:rPr>
-        <w:t>x</w:t>
-      </w:r>
-      <w:proofErr w:type="gramEnd"/>
+        <w:t>x_min</w:t>
+      </w:r>
+      <w:r>
+        <w:rPr>
+          <w:rFonts w:ascii="Consolas" w:eastAsiaTheme="minorEastAsia" w:hAnsi="Consolas"/>
+          <w:color w:val="666666"/>
+          <w:sz w:val="22"/>
+          <w:shd w:val="clear" w:color="auto" w:fill="auto"/>
+          <w:lang w:eastAsia="en-US"/>
+        </w:rPr>
+        <w:t>,</w:t>
+      </w:r>
       <w:r>
         <w:rPr>
           <w:rFonts w:ascii="Consolas" w:eastAsiaTheme="minorEastAsia" w:hAnsi="Consolas"/>
@@ -894,9 +816,27 @@
           <w:shd w:val="clear" w:color="auto" w:fill="auto"/>
           <w:lang w:eastAsia="en-US"/>
         </w:rPr>
-        <w:t>_</w:t>
-      </w:r>
-      <w:proofErr w:type="gramStart"/>
+        <w:t>x_max</w:t>
+      </w:r>
+      <w:r>
+        <w:rPr>
+          <w:rFonts w:ascii="Consolas" w:eastAsiaTheme="minorEastAsia" w:hAnsi="Consolas"/>
+          <w:sz w:val="22"/>
+          <w:shd w:val="clear" w:color="auto" w:fill="auto"/>
+          <w:lang w:eastAsia="en-US"/>
+        </w:rPr>
+        <w:t>)</w:t>
+      </w:r>
+      <w:r>
+        <w:rPr>
+          <w:rFonts w:ascii="Consolas" w:eastAsiaTheme="minorEastAsia" w:hAnsi="Consolas"/>
+          <w:sz w:val="22"/>
+          <w:shd w:val="clear" w:color="auto" w:fill="auto"/>
+          <w:lang w:eastAsia="en-US"/>
+        </w:rPr>
+        <w:br/>
+        <w:t xml:space="preserve">    </w:t>
+      </w:r>
       <w:r>
         <w:rPr>
           <w:rFonts w:ascii="Consolas" w:eastAsiaTheme="minorEastAsia" w:hAnsi="Consolas"/>
@@ -905,7 +845,7 @@
           <w:shd w:val="clear" w:color="auto" w:fill="auto"/>
           <w:lang w:eastAsia="en-US"/>
         </w:rPr>
-        <w:t>min</w:t>
+        <w:t>y</w:t>
       </w:r>
       <w:r>
         <w:rPr>
@@ -915,7 +855,7 @@
           <w:shd w:val="clear" w:color="auto" w:fill="auto"/>
           <w:lang w:eastAsia="en-US"/>
         </w:rPr>
-        <w:t>,</w:t>
+        <w:t>=</w:t>
       </w:r>
       <w:r>
         <w:rPr>
@@ -925,9 +865,17 @@
           <w:shd w:val="clear" w:color="auto" w:fill="auto"/>
           <w:lang w:eastAsia="en-US"/>
         </w:rPr>
-        <w:t>x</w:t>
-      </w:r>
-      <w:proofErr w:type="gramEnd"/>
+        <w:t>min</w:t>
+      </w:r>
+      <w:r>
+        <w:rPr>
+          <w:rFonts w:ascii="Consolas" w:eastAsiaTheme="minorEastAsia" w:hAnsi="Consolas"/>
+          <w:sz w:val="22"/>
+          <w:shd w:val="clear" w:color="auto" w:fill="auto"/>
+          <w:lang w:eastAsia="en-US"/>
+        </w:rPr>
+        <w:t>(</w:t>
+      </w:r>
       <w:r>
         <w:rPr>
           <w:rFonts w:ascii="Consolas" w:eastAsiaTheme="minorEastAsia" w:hAnsi="Consolas"/>
@@ -936,7 +884,7 @@
           <w:shd w:val="clear" w:color="auto" w:fill="auto"/>
           <w:lang w:eastAsia="en-US"/>
         </w:rPr>
-        <w:t>_max</w:t>
+        <w:t>max</w:t>
       </w:r>
       <w:r>
         <w:rPr>
@@ -945,17 +893,7 @@
           <w:shd w:val="clear" w:color="auto" w:fill="auto"/>
           <w:lang w:eastAsia="en-US"/>
         </w:rPr>
-        <w:t>)</w:t>
-      </w:r>
-      <w:r>
-        <w:rPr>
-          <w:rFonts w:ascii="Consolas" w:eastAsiaTheme="minorEastAsia" w:hAnsi="Consolas"/>
-          <w:sz w:val="22"/>
-          <w:shd w:val="clear" w:color="auto" w:fill="auto"/>
-          <w:lang w:eastAsia="en-US"/>
-        </w:rPr>
-        <w:br/>
-        <w:t xml:space="preserve">    </w:t>
+        <w:t>(</w:t>
       </w:r>
       <w:r>
         <w:rPr>
@@ -965,7 +903,7 @@
           <w:shd w:val="clear" w:color="auto" w:fill="auto"/>
           <w:lang w:eastAsia="en-US"/>
         </w:rPr>
-        <w:t>y</w:t>
+        <w:t>x</w:t>
       </w:r>
       <w:r>
         <w:rPr>
@@ -975,7 +913,7 @@
           <w:shd w:val="clear" w:color="auto" w:fill="auto"/>
           <w:lang w:eastAsia="en-US"/>
         </w:rPr>
-        <w:t>=</w:t>
+        <w:t>,</w:t>
       </w:r>
       <w:r>
         <w:rPr>
@@ -985,7 +923,7 @@
           <w:shd w:val="clear" w:color="auto" w:fill="auto"/>
           <w:lang w:eastAsia="en-US"/>
         </w:rPr>
-        <w:t>min</w:t>
+        <w:t>x_min</w:t>
       </w:r>
       <w:r>
         <w:rPr>
@@ -994,7 +932,17 @@
           <w:shd w:val="clear" w:color="auto" w:fill="auto"/>
           <w:lang w:eastAsia="en-US"/>
         </w:rPr>
-        <w:t>(</w:t>
+        <w:t>)</w:t>
+      </w:r>
+      <w:r>
+        <w:rPr>
+          <w:rFonts w:ascii="Consolas" w:eastAsiaTheme="minorEastAsia" w:hAnsi="Consolas"/>
+          <w:color w:val="666666"/>
+          <w:sz w:val="22"/>
+          <w:shd w:val="clear" w:color="auto" w:fill="auto"/>
+          <w:lang w:eastAsia="en-US"/>
+        </w:rPr>
+        <w:t>,</w:t>
       </w:r>
       <w:r>
         <w:rPr>
@@ -1004,99 +952,7 @@
           <w:shd w:val="clear" w:color="auto" w:fill="auto"/>
           <w:lang w:eastAsia="en-US"/>
         </w:rPr>
-        <w:t>max</w:t>
-      </w:r>
-      <w:r>
-        <w:rPr>
-          <w:rFonts w:ascii="Consolas" w:eastAsiaTheme="minorEastAsia" w:hAnsi="Consolas"/>
-          <w:sz w:val="22"/>
-          <w:shd w:val="clear" w:color="auto" w:fill="auto"/>
-          <w:lang w:eastAsia="en-US"/>
-        </w:rPr>
-        <w:t>(</w:t>
-      </w:r>
-      <w:proofErr w:type="gramStart"/>
-      <w:r>
-        <w:rPr>
-          <w:rFonts w:ascii="Consolas" w:eastAsiaTheme="minorEastAsia" w:hAnsi="Consolas"/>
-          <w:color w:val="19177C"/>
-          <w:sz w:val="22"/>
-          <w:shd w:val="clear" w:color="auto" w:fill="auto"/>
-          <w:lang w:eastAsia="en-US"/>
-        </w:rPr>
-        <w:t>x</w:t>
-      </w:r>
-      <w:r>
-        <w:rPr>
-          <w:rFonts w:ascii="Consolas" w:eastAsiaTheme="minorEastAsia" w:hAnsi="Consolas"/>
-          <w:color w:val="666666"/>
-          <w:sz w:val="22"/>
-          <w:shd w:val="clear" w:color="auto" w:fill="auto"/>
-          <w:lang w:eastAsia="en-US"/>
-        </w:rPr>
-        <w:t>,</w:t>
-      </w:r>
-      <w:r>
-        <w:rPr>
-          <w:rFonts w:ascii="Consolas" w:eastAsiaTheme="minorEastAsia" w:hAnsi="Consolas"/>
-          <w:color w:val="19177C"/>
-          <w:sz w:val="22"/>
-          <w:shd w:val="clear" w:color="auto" w:fill="auto"/>
-          <w:lang w:eastAsia="en-US"/>
-        </w:rPr>
-        <w:t>x</w:t>
-      </w:r>
-      <w:proofErr w:type="gramEnd"/>
-      <w:r>
-        <w:rPr>
-          <w:rFonts w:ascii="Consolas" w:eastAsiaTheme="minorEastAsia" w:hAnsi="Consolas"/>
-          <w:color w:val="19177C"/>
-          <w:sz w:val="22"/>
-          <w:shd w:val="clear" w:color="auto" w:fill="auto"/>
-          <w:lang w:eastAsia="en-US"/>
-        </w:rPr>
-        <w:t>_min</w:t>
-      </w:r>
-      <w:proofErr w:type="gramStart"/>
-      <w:r>
-        <w:rPr>
-          <w:rFonts w:ascii="Consolas" w:eastAsiaTheme="minorEastAsia" w:hAnsi="Consolas"/>
-          <w:sz w:val="22"/>
-          <w:shd w:val="clear" w:color="auto" w:fill="auto"/>
-          <w:lang w:eastAsia="en-US"/>
-        </w:rPr>
-        <w:t>)</w:t>
-      </w:r>
-      <w:r>
-        <w:rPr>
-          <w:rFonts w:ascii="Consolas" w:eastAsiaTheme="minorEastAsia" w:hAnsi="Consolas"/>
-          <w:color w:val="666666"/>
-          <w:sz w:val="22"/>
-          <w:shd w:val="clear" w:color="auto" w:fill="auto"/>
-          <w:lang w:eastAsia="en-US"/>
-        </w:rPr>
-        <w:t>,</w:t>
-      </w:r>
-      <w:r>
-        <w:rPr>
-          <w:rFonts w:ascii="Consolas" w:eastAsiaTheme="minorEastAsia" w:hAnsi="Consolas"/>
-          <w:color w:val="19177C"/>
-          <w:sz w:val="22"/>
-          <w:shd w:val="clear" w:color="auto" w:fill="auto"/>
-          <w:lang w:eastAsia="en-US"/>
-        </w:rPr>
-        <w:t>x</w:t>
-      </w:r>
-      <w:proofErr w:type="gramEnd"/>
-      <w:r>
-        <w:rPr>
-          <w:rFonts w:ascii="Consolas" w:eastAsiaTheme="minorEastAsia" w:hAnsi="Consolas"/>
-          <w:color w:val="19177C"/>
-          <w:sz w:val="22"/>
-          <w:shd w:val="clear" w:color="auto" w:fill="auto"/>
-          <w:lang w:eastAsia="en-US"/>
-        </w:rPr>
-        <w:t>_max</w:t>
+        <w:t>x_max</w:t>
       </w:r>
       <w:r>
         <w:rPr>
@@ -1141,29 +997,27 @@
     <w:p>
       <w:pPr>
         <w:pStyle w:val="FirstParagraph"/>
+        <w:ind w:firstLine="480"/>
       </w:pPr>
       <w:r>
         <w:t>行内代码：</w:t>
       </w:r>
-      <w:proofErr w:type="gramStart"/>
+      <w:r>
+        <w:t xml:space="preserve"> </w:t>
+      </w:r>
       <w:r>
         <w:rPr>
           <w:rStyle w:val="InlineCode"/>
         </w:rPr>
-        <w:t>disp(</w:t>
-      </w:r>
-      <w:proofErr w:type="gramEnd"/>
-      <w:r>
-        <w:rPr>
-          <w:rStyle w:val="InlineCode"/>
-        </w:rPr>
-        <w:t>"Hello Matlab")</w:t>
+        <w:t>disp("Hello Matlab")</w:t>
       </w:r>
     </w:p>
     <w:p>
       <w:pPr>
         <w:pStyle w:val="3"/>
       </w:pPr>
+      <w:bookmarkStart w:id="23" w:name="表格"/>
+      <w:bookmarkEnd w:id="22"/>
       <w:r>
         <w:t>表格</w:t>
       </w:r>
@@ -1171,6 +1025,7 @@
     <w:p>
       <w:pPr>
         <w:pStyle w:val="FirstParagraph"/>
+        <w:ind w:firstLine="480"/>
       </w:pPr>
       <w:r>
         <w:t>表格采用三线表格式</w:t>
@@ -1199,7 +1054,7 @@
             <w:pPr>
               <w:pStyle w:val="Compact"/>
             </w:pPr>
-            <w:bookmarkStart w:id="23" w:name="X6089eb22db8dbe1e72e38bf9d2c41848a4c9a45"/>
+            <w:bookmarkStart w:id="24" w:name="X6089eb22db8dbe1e72e38bf9d2c41848a4c9a45"/>
             <w:r>
               <w:t>header 1</w:t>
             </w:r>
@@ -1275,42 +1130,14 @@
           </w:p>
         </w:tc>
       </w:tr>
-      <w:tr>
-        <w:tc>
-          <w:tcPr>
-            <w:tcW w:w="0" w:type="auto"/>
-          </w:tcPr>
-          <w:p>
-            <w:pPr>
-              <w:pStyle w:val="Compact"/>
-            </w:pPr>
-            <w:r>
-              <w:t>cell 5</w:t>
-            </w:r>
-          </w:p>
-        </w:tc>
-        <w:tc>
-          <w:tcPr>
-            <w:tcW w:w="0" w:type="auto"/>
-          </w:tcPr>
-          <w:p>
-            <w:pPr>
-              <w:pStyle w:val="Compact"/>
-            </w:pPr>
-            <w:r>
-              <w:t>cell 6</w:t>
-            </w:r>
-          </w:p>
-        </w:tc>
-      </w:tr>
     </w:tbl>
     <w:p>
       <w:pPr>
         <w:pStyle w:val="3"/>
       </w:pPr>
-      <w:bookmarkStart w:id="24" w:name="引述块样式"/>
-      <w:bookmarkEnd w:id="22"/>
+      <w:bookmarkStart w:id="25" w:name="引述块样式"/>
       <w:bookmarkEnd w:id="23"/>
+      <w:bookmarkEnd w:id="24"/>
       <w:r>
         <w:t>引述块样式</w:t>
       </w:r>
@@ -1321,6 +1148,9 @@
         <w:ind w:left="480" w:right="240"/>
       </w:pPr>
       <w:r>
+        <w:t>‍</w:t>
+      </w:r>
+      <w:r>
         <w:t>用完一堆笔记软件之后你会明白：最需要提升的并不是你所用的工具，</w:t>
       </w:r>
       <w:r>
@@ -1354,7 +1184,6 @@
     <w:p>
       <w:pPr>
         <w:pStyle w:val="CaptionedFigure"/>
-        <w:ind w:left="480" w:right="240"/>
         <w:rPr>
           <w:lang w:eastAsia="zh-CN"/>
         </w:rPr>
@@ -1365,10 +1194,10 @@
           <w:lang w:eastAsia="zh-CN"/>
         </w:rPr>
         <w:drawing>
-          <wp:inline distT="0" distB="0" distL="0" distR="0" wp14:anchorId="6AE7FCC8" wp14:editId="60D96DB4">
+          <wp:inline distT="0" distB="0" distL="0" distR="0" wp14:anchorId="5AABFB39" wp14:editId="5663C16E">
             <wp:extent cx="3388179" cy="2166868"/>
             <wp:effectExtent l="0" t="0" r="3175" b="5080"/>
-            <wp:docPr id="1571311645" name="图片 1" descr="图形用户界面, 文本, 应用程序, 电子邮件&#10;&#10;AI 生成的内容可能不正确。"/>
+            <wp:docPr id="1571311645" name="图片 1"/>
             <wp:cNvGraphicFramePr>
               <a:graphicFrameLocks xmlns:a="http://schemas.openxmlformats.org/drawingml/2006/main" noChangeAspect="1"/>
             </wp:cNvGraphicFramePr>
@@ -1376,7 +1205,7 @@
               <a:graphicData uri="http://schemas.openxmlformats.org/drawingml/2006/picture">
                 <pic:pic xmlns:pic="http://schemas.openxmlformats.org/drawingml/2006/picture">
                   <pic:nvPicPr>
-                    <pic:cNvPr id="1571311645" name="图片 1" descr="图形用户界面, 文本, 应用程序, 电子邮件&#10;&#10;AI 生成的内容可能不正确。"/>
+                    <pic:cNvPr id="1571311645" name=""/>
                     <pic:cNvPicPr/>
                   </pic:nvPicPr>
                   <pic:blipFill>
@@ -1404,7 +1233,6 @@
     <w:p>
       <w:pPr>
         <w:pStyle w:val="ImageCaption"/>
-        <w:ind w:left="480" w:hanging="480"/>
         <w:rPr>
           <w:lang w:eastAsia="zh-CN"/>
         </w:rPr>
@@ -1419,20 +1247,15 @@
     </w:p>
     <w:p>
       <w:pPr>
-        <w:pStyle w:val="FirstParagraph"/>
-      </w:pPr>
-    </w:p>
-    <w:p>
-      <w:pPr>
         <w:pStyle w:val="10"/>
         <w:rPr>
           <w:lang w:eastAsia="zh-CN"/>
         </w:rPr>
       </w:pPr>
-      <w:bookmarkStart w:id="25" w:name="如何修改此模板"/>
+      <w:bookmarkStart w:id="26" w:name="如何修改此模板"/>
       <w:bookmarkEnd w:id="0"/>
       <w:bookmarkEnd w:id="6"/>
-      <w:bookmarkEnd w:id="24"/>
+      <w:bookmarkEnd w:id="25"/>
       <w:r>
         <w:rPr>
           <w:lang w:eastAsia="zh-CN"/>
@@ -1444,6 +1267,7 @@
     <w:p>
       <w:pPr>
         <w:pStyle w:val="FirstParagraph"/>
+        <w:ind w:firstLine="480"/>
       </w:pPr>
       <w:r>
         <w:t>注意，要修改模板，需要更改每个类型对应的</w:t>
@@ -1463,17 +1287,26 @@
     </w:p>
     <w:p>
       <w:pPr>
-        <w:pStyle w:val="2"/>
-      </w:pPr>
-      <w:bookmarkStart w:id="26" w:name="一般样式"/>
-      <w:r>
+        <w:pStyle w:val="20"/>
+        <w:rPr>
+          <w:lang w:eastAsia="zh-CN"/>
+        </w:rPr>
+      </w:pPr>
+      <w:bookmarkStart w:id="27" w:name="一般样式"/>
+      <w:r>
+        <w:rPr>
+          <w:lang w:eastAsia="zh-CN"/>
+        </w:rPr>
         <w:t>一般样式</w:t>
       </w:r>
     </w:p>
     <w:p>
       <w:pPr>
         <w:pStyle w:val="FirstParagraph"/>
-      </w:pPr>
+        <w:ind w:firstLine="480"/>
+      </w:pPr>
+      <w:bookmarkStart w:id="28" w:name="表格样式"/>
+      <w:bookmarkEnd w:id="27"/>
       <w:r>
         <w:t>一般样式，只需要打开</w:t>
       </w:r>
@@ -1487,6 +1320,7 @@
     <w:p>
       <w:pPr>
         <w:pStyle w:val="a0"/>
+        <w:ind w:firstLine="480"/>
       </w:pPr>
       <w:r>
         <w:t>一般样式如下：</w:t>
@@ -1516,7 +1350,7 @@
             <w:pPr>
               <w:pStyle w:val="Compact"/>
             </w:pPr>
-            <w:bookmarkStart w:id="27" w:name="Xe23ef773142235f30e844f2528dbe301873a9b9"/>
+            <w:bookmarkStart w:id="29" w:name="Xe23ef773142235f30e844f2528dbe301873a9b9"/>
             <w:r>
               <w:t>样式名</w:t>
             </w:r>
@@ -1761,11 +1595,9 @@
             <w:r>
               <w:br/>
             </w:r>
-            <w:proofErr w:type="gramStart"/>
             <w:r>
               <w:t>段前</w:t>
             </w:r>
-            <w:proofErr w:type="gramEnd"/>
             <w:r>
               <w:t xml:space="preserve">24 </w:t>
             </w:r>
@@ -1888,13 +1720,7 @@
               <w:rPr>
                 <w:rFonts w:hint="eastAsia"/>
               </w:rPr>
-              <w:t>号</w:t>
-            </w:r>
-            <w:r>
-              <w:rPr>
-                <w:rFonts w:hint="eastAsia"/>
-              </w:rPr>
-              <w:t>小三</w:t>
+              <w:t>号小三</w:t>
             </w:r>
             <w:r>
               <w:t>，加粗，中文字体为黑体，英文</w:t>
@@ -2131,7 +1957,13 @@
               <w:pStyle w:val="Compact"/>
             </w:pPr>
             <w:r>
-              <w:t>左侧设置为</w:t>
+              <w:t>四周添加</w:t>
+            </w:r>
+            <w:r>
+              <w:t>1</w:t>
+            </w:r>
+            <w:r>
+              <w:t>磅边框，左侧设置为</w:t>
             </w:r>
             <w:r>
               <w:t>6</w:t>
@@ -2190,10 +2022,11 @@
         </w:tc>
       </w:tr>
     </w:tbl>
-    <w:bookmarkEnd w:id="27"/>
+    <w:bookmarkEnd w:id="29"/>
     <w:p>
       <w:pPr>
         <w:pStyle w:val="a0"/>
+        <w:ind w:firstLine="480"/>
       </w:pPr>
       <w:r>
         <w:t>修改表格样式和列表样式比较特殊</w:t>
@@ -2201,17 +2034,22 @@
     </w:p>
     <w:p>
       <w:pPr>
-        <w:pStyle w:val="2"/>
-      </w:pPr>
-      <w:bookmarkStart w:id="28" w:name="表格样式"/>
-      <w:bookmarkEnd w:id="26"/>
-      <w:r>
+        <w:pStyle w:val="20"/>
+        <w:rPr>
+          <w:lang w:eastAsia="zh-CN"/>
+        </w:rPr>
+      </w:pPr>
+      <w:r>
+        <w:rPr>
+          <w:lang w:eastAsia="zh-CN"/>
+        </w:rPr>
         <w:t>表格样式</w:t>
       </w:r>
     </w:p>
     <w:p>
       <w:pPr>
         <w:pStyle w:val="FirstParagraph"/>
+        <w:ind w:firstLine="480"/>
       </w:pPr>
       <w:r>
         <w:t>修改表格需要点击表格后，在【表设计】下拉，点击【修改表格样式】，进行修改</w:t>
@@ -2220,6 +2058,7 @@
     <w:p>
       <w:pPr>
         <w:pStyle w:val="a0"/>
+        <w:ind w:firstLine="480"/>
       </w:pPr>
       <w:r>
         <w:t>​</w:t>
@@ -2273,11 +2112,17 @@
     </w:p>
     <w:p>
       <w:pPr>
-        <w:pStyle w:val="2"/>
-      </w:pPr>
-      <w:bookmarkStart w:id="29" w:name="列表样式"/>
+        <w:pStyle w:val="20"/>
+        <w:rPr>
+          <w:lang w:eastAsia="zh-CN"/>
+        </w:rPr>
+      </w:pPr>
+      <w:bookmarkStart w:id="30" w:name="列表样式"/>
       <w:bookmarkEnd w:id="28"/>
       <w:r>
+        <w:rPr>
+          <w:lang w:eastAsia="zh-CN"/>
+        </w:rPr>
         <w:lastRenderedPageBreak/>
         <w:t>列表样式</w:t>
       </w:r>
@@ -2285,9 +2130,15 @@
     <w:p>
       <w:pPr>
         <w:pStyle w:val="3"/>
-      </w:pPr>
-      <w:bookmarkStart w:id="30" w:name="修改列表层级样式"/>
-      <w:r>
+        <w:rPr>
+          <w:lang w:eastAsia="zh-CN"/>
+        </w:rPr>
+      </w:pPr>
+      <w:bookmarkStart w:id="31" w:name="修改列表层级样式"/>
+      <w:r>
+        <w:rPr>
+          <w:lang w:eastAsia="zh-CN"/>
+        </w:rPr>
         <w:t>修改列表层级样式</w:t>
       </w:r>
     </w:p>
@@ -2303,6 +2154,7 @@
     <w:p>
       <w:pPr>
         <w:pStyle w:val="FirstParagraph"/>
+        <w:ind w:firstLine="480"/>
       </w:pPr>
       <w:r>
         <w:t>在下图</w:t>
@@ -2317,6 +2169,7 @@
     <w:p>
       <w:pPr>
         <w:pStyle w:val="a0"/>
+        <w:ind w:firstLine="480"/>
       </w:pPr>
       <w:r>
         <w:lastRenderedPageBreak/>
@@ -2375,6 +2228,7 @@
     <w:p>
       <w:pPr>
         <w:pStyle w:val="a0"/>
+        <w:ind w:firstLine="480"/>
       </w:pPr>
       <w:r>
         <w:lastRenderedPageBreak/>
@@ -2433,16 +2287,23 @@
     <w:p>
       <w:pPr>
         <w:pStyle w:val="3"/>
-      </w:pPr>
-      <w:bookmarkStart w:id="31" w:name="修改列表缩进"/>
-      <w:bookmarkEnd w:id="30"/>
-      <w:r>
+        <w:rPr>
+          <w:lang w:eastAsia="zh-CN"/>
+        </w:rPr>
+      </w:pPr>
+      <w:bookmarkStart w:id="32" w:name="修改列表缩进"/>
+      <w:bookmarkEnd w:id="31"/>
+      <w:r>
+        <w:rPr>
+          <w:lang w:eastAsia="zh-CN"/>
+        </w:rPr>
         <w:t>修改列表缩进</w:t>
       </w:r>
     </w:p>
     <w:p>
       <w:pPr>
         <w:pStyle w:val="FirstParagraph"/>
+        <w:ind w:firstLine="480"/>
       </w:pPr>
       <w:r>
         <w:t>鼠标点击列表所在行，右键点击【调整列表缩进】，选择【设置所有级别】</w:t>
@@ -2451,6 +2312,7 @@
     <w:p>
       <w:pPr>
         <w:pStyle w:val="a0"/>
+        <w:ind w:firstLine="480"/>
       </w:pPr>
       <w:r>
         <w:lastRenderedPageBreak/>
@@ -2509,6 +2371,7 @@
     <w:p>
       <w:pPr>
         <w:pStyle w:val="a0"/>
+        <w:ind w:firstLine="480"/>
       </w:pPr>
       <w:r>
         <w:t>‍</w:t>
@@ -2518,10 +2381,10 @@
       <w:pPr>
         <w:pStyle w:val="10"/>
       </w:pPr>
-      <w:bookmarkStart w:id="32" w:name="模板已知问题"/>
-      <w:bookmarkEnd w:id="25"/>
-      <w:bookmarkEnd w:id="29"/>
-      <w:bookmarkEnd w:id="31"/>
+      <w:bookmarkStart w:id="33" w:name="模板已知问题"/>
+      <w:bookmarkEnd w:id="26"/>
+      <w:bookmarkEnd w:id="30"/>
+      <w:bookmarkEnd w:id="32"/>
       <w:r>
         <w:lastRenderedPageBreak/>
         <w:t>模板已知问题</w:t>
@@ -2531,62 +2394,34 @@
       <w:pPr>
         <w:numPr>
           <w:ilvl w:val="0"/>
-          <w:numId w:val="20"/>
+          <w:numId w:val="21"/>
         </w:numPr>
         <w:rPr>
           <w:lang w:eastAsia="zh-CN"/>
         </w:rPr>
       </w:pPr>
-      <w:bookmarkStart w:id="33" w:name="X6cff98a280b29a0705c815143a143528431bbc3"/>
-      <w:r>
-        <w:rPr>
-          <w:lang w:eastAsia="zh-CN"/>
-        </w:rPr>
-        <w:t>图片无法自动居中，另外注意图片添加</w:t>
-      </w:r>
-      <w:proofErr w:type="gramStart"/>
-      <w:r>
-        <w:rPr>
-          <w:lang w:eastAsia="zh-CN"/>
-        </w:rPr>
-        <w:t>题注要居中</w:t>
-      </w:r>
-      <w:proofErr w:type="gramEnd"/>
-      <w:r>
-        <w:rPr>
-          <w:lang w:eastAsia="zh-CN"/>
-        </w:rPr>
-        <w:t>的话，必须先让图片居中，再添加题注。</w:t>
+      <w:bookmarkStart w:id="34" w:name="X6cff98a280b29a0705c815143a143528431bbc3"/>
+      <w:r>
+        <w:rPr>
+          <w:lang w:eastAsia="zh-CN"/>
+        </w:rPr>
+        <w:t>图片无法自动居中，另外注意图片添加题注要居中的话，必须先让图片居中，再添加题注。</w:t>
       </w:r>
     </w:p>
     <w:p>
       <w:pPr>
         <w:numPr>
           <w:ilvl w:val="0"/>
-          <w:numId w:val="20"/>
+          <w:numId w:val="21"/>
         </w:numPr>
       </w:pPr>
-      <w:bookmarkStart w:id="34" w:name="X3f5d58367afd2f4cc3b19740daabc7f87274dd9"/>
-      <w:bookmarkEnd w:id="33"/>
-      <w:r>
-        <w:rPr>
-          <w:lang w:eastAsia="zh-CN"/>
-        </w:rPr>
-        <w:t>模板可以做到表格整体居中，但是表格单元格自动居中需要思源笔记文档中的表格</w:t>
-      </w:r>
-      <w:proofErr w:type="gramStart"/>
-      <w:r>
-        <w:rPr>
-          <w:lang w:eastAsia="zh-CN"/>
-        </w:rPr>
-        <w:t>本身先</w:t>
-      </w:r>
-      <w:proofErr w:type="gramEnd"/>
-      <w:r>
-        <w:rPr>
-          <w:lang w:eastAsia="zh-CN"/>
-        </w:rPr>
-        <w:t>设置居中，否则不居中。</w:t>
+      <w:bookmarkStart w:id="35" w:name="X3f5d58367afd2f4cc3b19740daabc7f87274dd9"/>
+      <w:bookmarkEnd w:id="34"/>
+      <w:r>
+        <w:rPr>
+          <w:lang w:eastAsia="zh-CN"/>
+        </w:rPr>
+        <w:t>模板可以做到表格整体居中，但是表格单元格自动居中需要思源笔记文档中的表格本身先设置居中，否则不居中。</w:t>
       </w:r>
       <w:r>
         <w:t>这是因为</w:t>
@@ -2609,7 +2444,7 @@
         <w:pStyle w:val="SourceCode"/>
         <w:numPr>
           <w:ilvl w:val="0"/>
-          <w:numId w:val="4"/>
+          <w:numId w:val="3"/>
         </w:numPr>
         <w:ind w:left="1200"/>
       </w:pPr>
@@ -2622,153 +2457,41 @@
       <w:r>
         <w:br/>
       </w:r>
-      <w:proofErr w:type="gramStart"/>
       <w:r>
         <w:rPr>
           <w:rStyle w:val="VerbatimChar"/>
         </w:rPr>
-        <w:t>| :</w:t>
-      </w:r>
-      <w:proofErr w:type="gramEnd"/>
+        <w:t>| :--------: | :--------: |</w:t>
+      </w:r>
+      <w:r>
+        <w:br/>
+      </w:r>
       <w:r>
         <w:rPr>
           <w:rStyle w:val="VerbatimChar"/>
         </w:rPr>
-        <w:t xml:space="preserve">--------: </w:t>
-      </w:r>
-      <w:proofErr w:type="gramStart"/>
+        <w:t>|  cell 1  |  cell 2  |</w:t>
+      </w:r>
+      <w:r>
+        <w:br/>
+      </w:r>
       <w:r>
         <w:rPr>
           <w:rStyle w:val="VerbatimChar"/>
         </w:rPr>
-        <w:t>| :</w:t>
-      </w:r>
-      <w:proofErr w:type="gramEnd"/>
+        <w:t>|  cell 3  |  cell 4  |</w:t>
+      </w:r>
+      <w:r>
+        <w:br/>
+      </w:r>
       <w:r>
         <w:rPr>
           <w:rStyle w:val="VerbatimChar"/>
         </w:rPr>
-        <w:t>--------: |</w:t>
-      </w:r>
-      <w:r>
-        <w:br/>
-      </w:r>
-      <w:proofErr w:type="gramStart"/>
-      <w:r>
-        <w:rPr>
-          <w:rStyle w:val="VerbatimChar"/>
-        </w:rPr>
-        <w:t>|  cell</w:t>
-      </w:r>
-      <w:proofErr w:type="gramEnd"/>
-      <w:r>
-        <w:rPr>
-          <w:rStyle w:val="VerbatimChar"/>
-        </w:rPr>
-        <w:t xml:space="preserve"> </w:t>
-      </w:r>
-      <w:proofErr w:type="gramStart"/>
-      <w:r>
-        <w:rPr>
-          <w:rStyle w:val="VerbatimChar"/>
-        </w:rPr>
-        <w:t>1  |</w:t>
-      </w:r>
-      <w:proofErr w:type="gramEnd"/>
-      <w:r>
-        <w:rPr>
-          <w:rStyle w:val="VerbatimChar"/>
-        </w:rPr>
-        <w:t xml:space="preserve">  cell </w:t>
-      </w:r>
-      <w:proofErr w:type="gramStart"/>
-      <w:r>
-        <w:rPr>
-          <w:rStyle w:val="VerbatimChar"/>
-        </w:rPr>
-        <w:t>2  |</w:t>
-      </w:r>
-      <w:proofErr w:type="gramEnd"/>
-      <w:r>
-        <w:br/>
-      </w:r>
-      <w:proofErr w:type="gramStart"/>
-      <w:r>
-        <w:rPr>
-          <w:rStyle w:val="VerbatimChar"/>
-        </w:rPr>
-        <w:t>|  cell</w:t>
-      </w:r>
-      <w:proofErr w:type="gramEnd"/>
-      <w:r>
-        <w:rPr>
-          <w:rStyle w:val="VerbatimChar"/>
-        </w:rPr>
-        <w:t xml:space="preserve"> </w:t>
-      </w:r>
-      <w:proofErr w:type="gramStart"/>
-      <w:r>
-        <w:rPr>
-          <w:rStyle w:val="VerbatimChar"/>
-        </w:rPr>
-        <w:t>3  |</w:t>
-      </w:r>
-      <w:proofErr w:type="gramEnd"/>
-      <w:r>
-        <w:rPr>
-          <w:rStyle w:val="VerbatimChar"/>
-        </w:rPr>
-        <w:t xml:space="preserve">  cell </w:t>
-      </w:r>
-      <w:proofErr w:type="gramStart"/>
-      <w:r>
-        <w:rPr>
-          <w:rStyle w:val="VerbatimChar"/>
-        </w:rPr>
-        <w:t>4  |</w:t>
-      </w:r>
-      <w:proofErr w:type="gramEnd"/>
-      <w:r>
-        <w:br/>
-      </w:r>
-      <w:proofErr w:type="gramStart"/>
-      <w:r>
-        <w:rPr>
-          <w:rStyle w:val="VerbatimChar"/>
-        </w:rPr>
-        <w:t>|  cell</w:t>
-      </w:r>
-      <w:proofErr w:type="gramEnd"/>
-      <w:r>
-        <w:rPr>
-          <w:rStyle w:val="VerbatimChar"/>
-        </w:rPr>
-        <w:t xml:space="preserve"> </w:t>
-      </w:r>
-      <w:proofErr w:type="gramStart"/>
-      <w:r>
-        <w:rPr>
-          <w:rStyle w:val="VerbatimChar"/>
-        </w:rPr>
-        <w:t>5  |</w:t>
-      </w:r>
-      <w:proofErr w:type="gramEnd"/>
-      <w:r>
-        <w:rPr>
-          <w:rStyle w:val="VerbatimChar"/>
-        </w:rPr>
-        <w:t xml:space="preserve">  cell </w:t>
-      </w:r>
-      <w:proofErr w:type="gramStart"/>
-      <w:r>
-        <w:rPr>
-          <w:rStyle w:val="VerbatimChar"/>
-        </w:rPr>
-        <w:t>6  |</w:t>
-      </w:r>
-      <w:bookmarkEnd w:id="32"/>
-      <w:bookmarkEnd w:id="34"/>
-      <w:proofErr w:type="gramEnd"/>
+        <w:t>|  cell 5  |  cell 6  |</w:t>
+      </w:r>
+      <w:bookmarkEnd w:id="33"/>
+      <w:bookmarkEnd w:id="35"/>
     </w:p>
     <w:sectPr>
       <w:footerReference w:type="default" r:id="rId14"/>
@@ -2952,7 +2675,7 @@
   <w:abstractNum w:abstractNumId="1" w15:restartNumberingAfterBreak="0">
     <w:nsid w:val="0000A991"/>
     <w:multiLevelType w:val="multilevel"/>
-    <w:tmpl w:val="D91823CE"/>
+    <w:tmpl w:val="AC362672"/>
     <w:lvl w:ilvl="0">
       <w:numFmt w:val="bullet"/>
       <w:suff w:val="space"/>
@@ -3074,7 +2797,7 @@
   <w:abstractNum w:abstractNumId="2" w15:restartNumberingAfterBreak="0">
     <w:nsid w:val="00A99201"/>
     <w:multiLevelType w:val="multilevel"/>
-    <w:tmpl w:val="3306C38E"/>
+    <w:tmpl w:val="2140DE3A"/>
     <w:lvl w:ilvl="0">
       <w:start w:val="1"/>
       <w:numFmt w:val="decimal"/>
@@ -3194,6 +2917,119 @@
     </w:lvl>
   </w:abstractNum>
   <w:abstractNum w:abstractNumId="3" w15:restartNumberingAfterBreak="0">
+    <w:nsid w:val="289471C0"/>
+    <w:multiLevelType w:val="hybridMultilevel"/>
+    <w:tmpl w:val="1FD8214E"/>
+    <w:lvl w:ilvl="0" w:tplc="04090001">
+      <w:start w:val="1"/>
+      <w:numFmt w:val="bullet"/>
+      <w:lvlText w:val=""/>
+      <w:lvlJc w:val="left"/>
+      <w:pPr>
+        <w:ind w:left="920" w:hanging="440"/>
+      </w:pPr>
+      <w:rPr>
+        <w:rFonts w:ascii="Wingdings" w:hAnsi="Wingdings" w:hint="default"/>
+      </w:rPr>
+    </w:lvl>
+    <w:lvl w:ilvl="1" w:tplc="04090003" w:tentative="1">
+      <w:start w:val="1"/>
+      <w:numFmt w:val="bullet"/>
+      <w:lvlText w:val=""/>
+      <w:lvlJc w:val="left"/>
+      <w:pPr>
+        <w:ind w:left="1360" w:hanging="440"/>
+      </w:pPr>
+      <w:rPr>
+        <w:rFonts w:ascii="Wingdings" w:hAnsi="Wingdings" w:hint="default"/>
+      </w:rPr>
+    </w:lvl>
+    <w:lvl w:ilvl="2" w:tplc="04090005" w:tentative="1">
+      <w:start w:val="1"/>
+      <w:numFmt w:val="bullet"/>
+      <w:lvlText w:val=""/>
+      <w:lvlJc w:val="left"/>
+      <w:pPr>
+        <w:ind w:left="1800" w:hanging="440"/>
+      </w:pPr>
+      <w:rPr>
+        <w:rFonts w:ascii="Wingdings" w:hAnsi="Wingdings" w:hint="default"/>
+      </w:rPr>
+    </w:lvl>
+    <w:lvl w:ilvl="3" w:tplc="04090001" w:tentative="1">
+      <w:start w:val="1"/>
+      <w:numFmt w:val="bullet"/>
+      <w:lvlText w:val=""/>
+      <w:lvlJc w:val="left"/>
+      <w:pPr>
+        <w:ind w:left="2240" w:hanging="440"/>
+      </w:pPr>
+      <w:rPr>
+        <w:rFonts w:ascii="Wingdings" w:hAnsi="Wingdings" w:hint="default"/>
+      </w:rPr>
+    </w:lvl>
+    <w:lvl w:ilvl="4" w:tplc="04090003" w:tentative="1">
+      <w:start w:val="1"/>
+      <w:numFmt w:val="bullet"/>
+      <w:lvlText w:val=""/>
+      <w:lvlJc w:val="left"/>
+      <w:pPr>
+        <w:ind w:left="2680" w:hanging="440"/>
+      </w:pPr>
+      <w:rPr>
+        <w:rFonts w:ascii="Wingdings" w:hAnsi="Wingdings" w:hint="default"/>
+      </w:rPr>
+    </w:lvl>
+    <w:lvl w:ilvl="5" w:tplc="04090005" w:tentative="1">
+      <w:start w:val="1"/>
+      <w:numFmt w:val="bullet"/>
+      <w:lvlText w:val=""/>
+      <w:lvlJc w:val="left"/>
+      <w:pPr>
+        <w:ind w:left="3120" w:hanging="440"/>
+      </w:pPr>
+      <w:rPr>
+        <w:rFonts w:ascii="Wingdings" w:hAnsi="Wingdings" w:hint="default"/>
+      </w:rPr>
+    </w:lvl>
+    <w:lvl w:ilvl="6" w:tplc="04090001" w:tentative="1">
+      <w:start w:val="1"/>
+      <w:numFmt w:val="bullet"/>
+      <w:lvlText w:val=""/>
+      <w:lvlJc w:val="left"/>
+      <w:pPr>
+        <w:ind w:left="3560" w:hanging="440"/>
+      </w:pPr>
+      <w:rPr>
+        <w:rFonts w:ascii="Wingdings" w:hAnsi="Wingdings" w:hint="default"/>
+      </w:rPr>
+    </w:lvl>
+    <w:lvl w:ilvl="7" w:tplc="04090003" w:tentative="1">
+      <w:start w:val="1"/>
+      <w:numFmt w:val="bullet"/>
+      <w:lvlText w:val=""/>
+      <w:lvlJc w:val="left"/>
+      <w:pPr>
+        <w:ind w:left="4000" w:hanging="440"/>
+      </w:pPr>
+      <w:rPr>
+        <w:rFonts w:ascii="Wingdings" w:hAnsi="Wingdings" w:hint="default"/>
+      </w:rPr>
+    </w:lvl>
+    <w:lvl w:ilvl="8" w:tplc="04090005" w:tentative="1">
+      <w:start w:val="1"/>
+      <w:numFmt w:val="bullet"/>
+      <w:lvlText w:val=""/>
+      <w:lvlJc w:val="left"/>
+      <w:pPr>
+        <w:ind w:left="4440" w:hanging="440"/>
+      </w:pPr>
+      <w:rPr>
+        <w:rFonts w:ascii="Wingdings" w:hAnsi="Wingdings" w:hint="default"/>
+      </w:rPr>
+    </w:lvl>
+  </w:abstractNum>
+  <w:abstractNum w:abstractNumId="4" w15:restartNumberingAfterBreak="0">
     <w:nsid w:val="2BC278D3"/>
     <w:multiLevelType w:val="multilevel"/>
     <w:tmpl w:val="5262CB2E"/>
@@ -3307,141 +3143,11 @@
       </w:rPr>
     </w:lvl>
   </w:abstractNum>
-  <w:abstractNum w:abstractNumId="4" w15:restartNumberingAfterBreak="0">
-    <w:nsid w:val="4441231C"/>
-    <w:multiLevelType w:val="multilevel"/>
-    <w:tmpl w:val="C8BA27AA"/>
-    <w:lvl w:ilvl="0">
-      <w:start w:val="1"/>
-      <w:numFmt w:val="decimal"/>
-      <w:pStyle w:val="2"/>
-      <w:suff w:val="space"/>
-      <w:lvlText w:val="%1"/>
-      <w:lvlJc w:val="left"/>
-      <w:pPr>
-        <w:ind w:left="0" w:firstLine="0"/>
-      </w:pPr>
-      <w:rPr>
-        <w:rFonts w:hint="eastAsia"/>
-      </w:rPr>
-    </w:lvl>
-    <w:lvl w:ilvl="1">
-      <w:start w:val="1"/>
-      <w:numFmt w:val="decimal"/>
-      <w:pStyle w:val="3"/>
-      <w:suff w:val="space"/>
-      <w:lvlText w:val="%1.%2"/>
-      <w:lvlJc w:val="left"/>
-      <w:pPr>
-        <w:ind w:left="0" w:firstLine="0"/>
-      </w:pPr>
-      <w:rPr>
-        <w:rFonts w:hint="eastAsia"/>
-      </w:rPr>
-    </w:lvl>
-    <w:lvl w:ilvl="2">
-      <w:start w:val="1"/>
-      <w:numFmt w:val="decimal"/>
-      <w:pStyle w:val="4"/>
-      <w:suff w:val="space"/>
-      <w:lvlText w:val="%1.%2.%3"/>
-      <w:lvlJc w:val="left"/>
-      <w:pPr>
-        <w:ind w:left="0" w:firstLine="0"/>
-      </w:pPr>
-      <w:rPr>
-        <w:rFonts w:hint="eastAsia"/>
-      </w:rPr>
-    </w:lvl>
-    <w:lvl w:ilvl="3">
-      <w:start w:val="1"/>
-      <w:numFmt w:val="decimal"/>
-      <w:pStyle w:val="5"/>
-      <w:suff w:val="space"/>
-      <w:lvlText w:val="%1.%2.%3.%4"/>
-      <w:lvlJc w:val="left"/>
-      <w:pPr>
-        <w:ind w:left="0" w:firstLine="0"/>
-      </w:pPr>
-      <w:rPr>
-        <w:rFonts w:hint="eastAsia"/>
-      </w:rPr>
-    </w:lvl>
-    <w:lvl w:ilvl="4">
-      <w:start w:val="1"/>
-      <w:numFmt w:val="decimal"/>
-      <w:pStyle w:val="6"/>
-      <w:suff w:val="space"/>
-      <w:lvlText w:val="%1.%2.%3.%4.%5"/>
-      <w:lvlJc w:val="left"/>
-      <w:pPr>
-        <w:ind w:left="0" w:firstLine="0"/>
-      </w:pPr>
-      <w:rPr>
-        <w:rFonts w:hint="eastAsia"/>
-      </w:rPr>
-    </w:lvl>
-    <w:lvl w:ilvl="5">
-      <w:start w:val="1"/>
-      <w:numFmt w:val="decimal"/>
-      <w:pStyle w:val="7"/>
-      <w:suff w:val="space"/>
-      <w:lvlText w:val="%1.%2.%3.%4.%5.%6"/>
-      <w:lvlJc w:val="left"/>
-      <w:pPr>
-        <w:ind w:left="0" w:firstLine="0"/>
-      </w:pPr>
-      <w:rPr>
-        <w:rFonts w:hint="eastAsia"/>
-      </w:rPr>
-    </w:lvl>
-    <w:lvl w:ilvl="6">
-      <w:start w:val="1"/>
-      <w:numFmt w:val="decimal"/>
-      <w:pStyle w:val="8"/>
-      <w:suff w:val="space"/>
-      <w:lvlText w:val="%1.%2.%3.%4.%5.%6.%7"/>
-      <w:lvlJc w:val="left"/>
-      <w:pPr>
-        <w:ind w:left="0" w:firstLine="0"/>
-      </w:pPr>
-      <w:rPr>
-        <w:rFonts w:hint="eastAsia"/>
-      </w:rPr>
-    </w:lvl>
-    <w:lvl w:ilvl="7">
-      <w:start w:val="1"/>
-      <w:numFmt w:val="decimal"/>
-      <w:pStyle w:val="9"/>
-      <w:suff w:val="space"/>
-      <w:lvlText w:val="%1.%2.%3.%4.%5.%6.%7.%8"/>
-      <w:lvlJc w:val="left"/>
-      <w:pPr>
-        <w:ind w:left="0" w:firstLine="0"/>
-      </w:pPr>
-      <w:rPr>
-        <w:rFonts w:hint="eastAsia"/>
-      </w:rPr>
-    </w:lvl>
-    <w:lvl w:ilvl="8">
-      <w:start w:val="1"/>
-      <w:numFmt w:val="decimal"/>
-      <w:suff w:val="space"/>
-      <w:lvlText w:val="%1.%2.%3.%4.%5.%6.%7.%8.%9"/>
-      <w:lvlJc w:val="left"/>
-      <w:pPr>
-        <w:ind w:left="0" w:firstLine="0"/>
-      </w:pPr>
-      <w:rPr>
-        <w:rFonts w:hint="eastAsia"/>
-      </w:rPr>
-    </w:lvl>
-  </w:abstractNum>
   <w:abstractNum w:abstractNumId="5" w15:restartNumberingAfterBreak="0">
     <w:nsid w:val="553929AC"/>
     <w:multiLevelType w:val="multilevel"/>
     <w:tmpl w:val="22C0AC60"/>
-    <w:styleLink w:val="20"/>
+    <w:styleLink w:val="2"/>
     <w:lvl w:ilvl="0">
       <w:start w:val="1"/>
       <w:numFmt w:val="decimal"/>
@@ -3552,21 +3258,24 @@
     </w:lvl>
   </w:abstractNum>
   <w:num w:numId="1" w16cid:durableId="179438853">
-    <w:abstractNumId w:val="3"/>
+    <w:abstractNumId w:val="4"/>
   </w:num>
   <w:num w:numId="2" w16cid:durableId="1185561364">
     <w:abstractNumId w:val="5"/>
   </w:num>
-  <w:num w:numId="3" w16cid:durableId="1964850438">
-    <w:abstractNumId w:val="4"/>
-  </w:num>
-  <w:num w:numId="4" w16cid:durableId="2049603216">
+  <w:num w:numId="3" w16cid:durableId="2049603216">
     <w:abstractNumId w:val="0"/>
   </w:num>
-  <w:num w:numId="5" w16cid:durableId="703869699">
+  <w:num w:numId="4" w16cid:durableId="703869699">
     <w:abstractNumId w:val="2"/>
   </w:num>
-  <w:num w:numId="6" w16cid:durableId="1822653246">
+  <w:num w:numId="5" w16cid:durableId="1822653246">
+    <w:abstractNumId w:val="2"/>
+  </w:num>
+  <w:num w:numId="6" w16cid:durableId="2079478619">
+    <w:abstractNumId w:val="2"/>
+  </w:num>
+  <w:num w:numId="7" w16cid:durableId="1567565266">
     <w:abstractNumId w:val="2"/>
     <w:lvlOverride w:ilvl="0">
       <w:startOverride w:val="1"/>
@@ -3596,10 +3305,7 @@
       <w:startOverride w:val="1"/>
     </w:lvlOverride>
   </w:num>
-  <w:num w:numId="7" w16cid:durableId="2079478619">
-    <w:abstractNumId w:val="2"/>
-  </w:num>
-  <w:num w:numId="8" w16cid:durableId="1567565266">
+  <w:num w:numId="8" w16cid:durableId="1744447668">
     <w:abstractNumId w:val="2"/>
     <w:lvlOverride w:ilvl="0">
       <w:startOverride w:val="1"/>
@@ -3629,7 +3335,7 @@
       <w:startOverride w:val="1"/>
     </w:lvlOverride>
   </w:num>
-  <w:num w:numId="9" w16cid:durableId="1744447668">
+  <w:num w:numId="9" w16cid:durableId="1594360317">
     <w:abstractNumId w:val="2"/>
     <w:lvlOverride w:ilvl="0">
       <w:startOverride w:val="1"/>
@@ -3659,7 +3365,7 @@
       <w:startOverride w:val="1"/>
     </w:lvlOverride>
   </w:num>
-  <w:num w:numId="10" w16cid:durableId="1594360317">
+  <w:num w:numId="10" w16cid:durableId="898518209">
     <w:abstractNumId w:val="2"/>
     <w:lvlOverride w:ilvl="0">
       <w:startOverride w:val="1"/>
@@ -3689,10 +3395,7 @@
       <w:startOverride w:val="1"/>
     </w:lvlOverride>
   </w:num>
-  <w:num w:numId="11" w16cid:durableId="898518209">
-    <w:abstractNumId w:val="2"/>
-  </w:num>
-  <w:num w:numId="12" w16cid:durableId="843059312">
+  <w:num w:numId="11" w16cid:durableId="843059312">
     <w:abstractNumId w:val="2"/>
     <w:lvlOverride w:ilvl="0">
       <w:startOverride w:val="1"/>
@@ -3722,28 +3425,34 @@
       <w:startOverride w:val="1"/>
     </w:lvlOverride>
   </w:num>
-  <w:num w:numId="13" w16cid:durableId="2111394418">
+  <w:num w:numId="12" w16cid:durableId="2111394418">
     <w:abstractNumId w:val="1"/>
   </w:num>
-  <w:num w:numId="14" w16cid:durableId="723678939">
+  <w:num w:numId="13" w16cid:durableId="723678939">
     <w:abstractNumId w:val="1"/>
   </w:num>
-  <w:num w:numId="15" w16cid:durableId="2047368205">
+  <w:num w:numId="14" w16cid:durableId="2047368205">
     <w:abstractNumId w:val="1"/>
   </w:num>
-  <w:num w:numId="16" w16cid:durableId="974989202">
+  <w:num w:numId="15" w16cid:durableId="974989202">
     <w:abstractNumId w:val="1"/>
   </w:num>
-  <w:num w:numId="17" w16cid:durableId="55974617">
+  <w:num w:numId="16" w16cid:durableId="55974617">
     <w:abstractNumId w:val="1"/>
   </w:num>
-  <w:num w:numId="18" w16cid:durableId="1273897876">
+  <w:num w:numId="17" w16cid:durableId="1273897876">
     <w:abstractNumId w:val="1"/>
   </w:num>
-  <w:num w:numId="19" w16cid:durableId="1449272727">
+  <w:num w:numId="18" w16cid:durableId="1449272727">
     <w:abstractNumId w:val="1"/>
   </w:num>
-  <w:num w:numId="20" w16cid:durableId="370495256">
+  <w:num w:numId="19" w16cid:durableId="154762627">
+    <w:abstractNumId w:val="1"/>
+  </w:num>
+  <w:num w:numId="20" w16cid:durableId="1122966913">
+    <w:abstractNumId w:val="1"/>
+  </w:num>
+  <w:num w:numId="21" w16cid:durableId="370495256">
     <w:abstractNumId w:val="2"/>
     <w:lvlOverride w:ilvl="0">
       <w:startOverride w:val="1"/>
@@ -3773,7 +3482,10 @@
       <w:startOverride w:val="1"/>
     </w:lvlOverride>
   </w:num>
-  <w:numIdMacAtCleanup w:val="20"/>
+  <w:num w:numId="22" w16cid:durableId="425224256">
+    <w:abstractNumId w:val="3"/>
+  </w:num>
+  <w:numIdMacAtCleanup w:val="21"/>
 </w:numbering>
 </file>
 
@@ -4051,7 +3763,7 @@
   <w:style w:type="paragraph" w:default="1" w:styleId="a">
     <w:name w:val="Normal"/>
     <w:qFormat/>
-    <w:rsid w:val="0006699E"/>
+    <w:rsid w:val="00BD3843"/>
     <w:pPr>
       <w:spacing w:after="0" w:line="360" w:lineRule="auto"/>
     </w:pPr>
@@ -4083,7 +3795,7 @@
       <w:szCs w:val="32"/>
     </w:rPr>
   </w:style>
-  <w:style w:type="paragraph" w:styleId="2">
+  <w:style w:type="paragraph" w:styleId="20">
     <w:name w:val="heading 2"/>
     <w:basedOn w:val="a"/>
     <w:next w:val="a0"/>
@@ -4094,9 +3806,6 @@
     <w:pPr>
       <w:keepNext/>
       <w:keepLines/>
-      <w:numPr>
-        <w:numId w:val="3"/>
-      </w:numPr>
       <w:spacing w:before="300"/>
       <w:outlineLvl w:val="1"/>
     </w:pPr>
@@ -4112,18 +3821,13 @@
     <w:name w:val="heading 3"/>
     <w:basedOn w:val="a"/>
     <w:next w:val="a0"/>
-    <w:link w:val="30"/>
     <w:uiPriority w:val="9"/>
     <w:unhideWhenUsed/>
     <w:qFormat/>
-    <w:rsid w:val="006E5ED4"/>
+    <w:rsid w:val="004A10CE"/>
     <w:pPr>
       <w:keepNext/>
       <w:keepLines/>
-      <w:numPr>
-        <w:ilvl w:val="1"/>
-        <w:numId w:val="3"/>
-      </w:numPr>
       <w:spacing w:before="200"/>
       <w:outlineLvl w:val="2"/>
     </w:pPr>
@@ -4131,7 +3835,7 @@
       <w:rFonts w:eastAsia="黑体" w:cstheme="majorBidi"/>
       <w:b/>
       <w:bCs/>
-      <w:sz w:val="30"/>
+      <w:sz w:val="28"/>
       <w:szCs w:val="28"/>
     </w:rPr>
   </w:style>
@@ -4139,17 +3843,14 @@
     <w:name w:val="heading 4"/>
     <w:basedOn w:val="a"/>
     <w:next w:val="a0"/>
+    <w:link w:val="40"/>
     <w:uiPriority w:val="9"/>
     <w:unhideWhenUsed/>
     <w:qFormat/>
-    <w:rsid w:val="006E5ED4"/>
+    <w:rsid w:val="004A10CE"/>
     <w:pPr>
       <w:keepNext/>
       <w:keepLines/>
-      <w:numPr>
-        <w:ilvl w:val="2"/>
-        <w:numId w:val="3"/>
-      </w:numPr>
       <w:spacing w:before="200"/>
       <w:outlineLvl w:val="3"/>
     </w:pPr>
@@ -4166,19 +3867,15 @@
     <w:uiPriority w:val="9"/>
     <w:unhideWhenUsed/>
     <w:qFormat/>
-    <w:rsid w:val="006E5ED4"/>
+    <w:rsid w:val="00BA49AB"/>
     <w:pPr>
       <w:keepNext/>
       <w:keepLines/>
-      <w:numPr>
-        <w:ilvl w:val="3"/>
-        <w:numId w:val="3"/>
-      </w:numPr>
       <w:spacing w:before="200"/>
       <w:outlineLvl w:val="4"/>
     </w:pPr>
     <w:rPr>
-      <w:rFonts w:eastAsia="黑体" w:cstheme="majorBidi"/>
+      <w:rFonts w:asciiTheme="majorHAnsi" w:eastAsia="黑体" w:hAnsiTheme="majorHAnsi" w:cstheme="majorBidi"/>
       <w:b/>
       <w:iCs/>
     </w:rPr>
@@ -4190,14 +3887,10 @@
     <w:uiPriority w:val="9"/>
     <w:unhideWhenUsed/>
     <w:qFormat/>
-    <w:rsid w:val="006E5ED4"/>
+    <w:rsid w:val="004A10CE"/>
     <w:pPr>
       <w:keepNext/>
       <w:keepLines/>
-      <w:numPr>
-        <w:ilvl w:val="4"/>
-        <w:numId w:val="3"/>
-      </w:numPr>
       <w:spacing w:before="200"/>
       <w:outlineLvl w:val="5"/>
     </w:pPr>
@@ -4216,10 +3909,6 @@
     <w:pPr>
       <w:keepNext/>
       <w:keepLines/>
-      <w:numPr>
-        <w:ilvl w:val="5"/>
-        <w:numId w:val="3"/>
-      </w:numPr>
       <w:spacing w:before="200"/>
       <w:outlineLvl w:val="6"/>
     </w:pPr>
@@ -4238,10 +3927,6 @@
     <w:pPr>
       <w:keepNext/>
       <w:keepLines/>
-      <w:numPr>
-        <w:ilvl w:val="6"/>
-        <w:numId w:val="3"/>
-      </w:numPr>
       <w:spacing w:before="200"/>
       <w:outlineLvl w:val="7"/>
     </w:pPr>
@@ -4260,10 +3945,6 @@
     <w:pPr>
       <w:keepNext/>
       <w:keepLines/>
-      <w:numPr>
-        <w:ilvl w:val="7"/>
-        <w:numId w:val="3"/>
-      </w:numPr>
       <w:spacing w:before="200"/>
       <w:outlineLvl w:val="8"/>
     </w:pPr>
@@ -4311,10 +3992,10 @@
     <w:basedOn w:val="a"/>
     <w:next w:val="a0"/>
     <w:qFormat/>
-    <w:rsid w:val="000C100F"/>
+    <w:rsid w:val="006629BB"/>
     <w:pPr>
       <w:spacing w:before="180"/>
-      <w:ind w:firstLineChars="200" w:firstLine="480"/>
+      <w:ind w:firstLineChars="200" w:firstLine="200"/>
     </w:pPr>
     <w:rPr>
       <w:lang w:eastAsia="zh-CN"/>
@@ -4324,7 +4005,7 @@
     <w:name w:val="Compact"/>
     <w:basedOn w:val="a0"/>
     <w:qFormat/>
-    <w:rsid w:val="00F17727"/>
+    <w:rsid w:val="001B6BBA"/>
     <w:pPr>
       <w:spacing w:before="60" w:after="60"/>
       <w:ind w:firstLineChars="0" w:firstLine="0"/>
@@ -4402,7 +4083,7 @@
     <w:name w:val="Bibliography"/>
     <w:basedOn w:val="a"/>
     <w:qFormat/>
-    <w:rsid w:val="006E5ED4"/>
+    <w:rsid w:val="006629BB"/>
     <w:pPr>
       <w:tabs>
         <w:tab w:val="left" w:pos="384"/>
@@ -4413,11 +4094,10 @@
   <w:style w:type="paragraph" w:styleId="a9">
     <w:name w:val="Block Text"/>
     <w:basedOn w:val="a"/>
-    <w:next w:val="a"/>
     <w:uiPriority w:val="9"/>
     <w:unhideWhenUsed/>
     <w:qFormat/>
-    <w:rsid w:val="00B2602F"/>
+    <w:rsid w:val="00113CC5"/>
     <w:pPr>
       <w:pBdr>
         <w:left w:val="single" w:sz="48" w:space="4" w:color="BFBFBF" w:themeColor="background1" w:themeShade="BF"/>
@@ -4526,7 +4206,7 @@
   <w:style w:type="paragraph" w:customStyle="1" w:styleId="Figure">
     <w:name w:val="Figure"/>
     <w:basedOn w:val="a"/>
-    <w:rsid w:val="00996935"/>
+    <w:rsid w:val="00D048A6"/>
     <w:pPr>
       <w:jc w:val="center"/>
     </w:pPr>
@@ -4534,7 +4214,7 @@
   <w:style w:type="paragraph" w:customStyle="1" w:styleId="CaptionedFigure">
     <w:name w:val="Captioned Figure"/>
     <w:basedOn w:val="Figure"/>
-    <w:rsid w:val="005C74B4"/>
+    <w:rsid w:val="00B8037B"/>
     <w:pPr>
       <w:keepNext/>
     </w:pPr>
@@ -4552,7 +4232,7 @@
     <w:name w:val="Verbatim Char"/>
     <w:basedOn w:val="ac"/>
     <w:link w:val="SourceCode"/>
-    <w:rsid w:val="005319BB"/>
+    <w:rsid w:val="00BF2EFB"/>
     <w:rPr>
       <w:rFonts w:ascii="Fira Code" w:eastAsia="宋体" w:hAnsi="Fira Code" w:cs="Times New Roman (正文 CS 字体)"/>
       <w:color w:val="404040" w:themeColor="text1" w:themeTint="BF"/>
@@ -4600,7 +4280,7 @@
     <w:basedOn w:val="a"/>
     <w:link w:val="VerbatimChar"/>
     <w:qFormat/>
-    <w:rsid w:val="005319BB"/>
+    <w:rsid w:val="00BF2EFB"/>
     <w:pPr>
       <w:pBdr>
         <w:top w:val="single" w:sz="8" w:space="10" w:color="BFBFBF" w:themeColor="background1" w:themeShade="BF"/>
@@ -4697,7 +4377,7 @@
       </w:numPr>
     </w:pPr>
   </w:style>
-  <w:style w:type="numbering" w:customStyle="1" w:styleId="20">
+  <w:style w:type="numbering" w:customStyle="1" w:styleId="2">
     <w:name w:val="列表2"/>
     <w:uiPriority w:val="99"/>
     <w:rsid w:val="00D42F07"/>
@@ -4753,26 +4433,16 @@
       <w:lang w:eastAsia="zh-CN"/>
     </w:rPr>
   </w:style>
-  <w:style w:type="character" w:styleId="af4">
-    <w:name w:val="Placeholder Text"/>
+  <w:style w:type="character" w:customStyle="1" w:styleId="40">
+    <w:name w:val="标题 4 字符"/>
     <w:basedOn w:val="a1"/>
-    <w:rsid w:val="0022655C"/>
-    <w:rPr>
-      <w:color w:val="666666"/>
-    </w:rPr>
-  </w:style>
-  <w:style w:type="character" w:customStyle="1" w:styleId="30">
-    <w:name w:val="标题 3 字符"/>
-    <w:basedOn w:val="a1"/>
-    <w:link w:val="3"/>
+    <w:link w:val="4"/>
     <w:uiPriority w:val="9"/>
-    <w:rsid w:val="005C74B4"/>
+    <w:rsid w:val="004A10CE"/>
     <w:rPr>
       <w:rFonts w:ascii="Times New Roman" w:eastAsia="黑体" w:hAnsi="Times New Roman" w:cstheme="majorBidi"/>
       <w:b/>
       <w:bCs/>
-      <w:sz w:val="30"/>
-      <w:szCs w:val="28"/>
     </w:rPr>
   </w:style>
   <w:style w:type="character" w:customStyle="1" w:styleId="InlineCode">
@@ -4780,7 +4450,7 @@
     <w:basedOn w:val="a1"/>
     <w:uiPriority w:val="1"/>
     <w:qFormat/>
-    <w:rsid w:val="00007D98"/>
+    <w:rsid w:val="00956EAC"/>
     <w:rPr>
       <w:rFonts w:ascii="Fira Code" w:eastAsia="宋体" w:hAnsi="Fira Code" w:cs="Times New Roman (正文 CS 字体)"/>
       <w:color w:val="404040" w:themeColor="text1" w:themeTint="BF"/>
@@ -5116,7 +4786,7 @@
 </file>
 
 <file path=customXml/itemProps1.xml><?xml version="1.0" encoding="utf-8"?>
-<ds:datastoreItem xmlns:ds="http://schemas.openxmlformats.org/officeDocument/2006/customXml" ds:itemID="{3F2F9186-A2BA-43B3-A892-09974D25829A}">
+<ds:datastoreItem xmlns:ds="http://schemas.openxmlformats.org/officeDocument/2006/customXml" ds:itemID="{0369DF99-6747-4B6F-A46C-5D6BE4DFDC26}">
   <ds:schemaRefs>
     <ds:schemaRef ds:uri="http://schemas.openxmlformats.org/officeDocument/2006/bibliography"/>
   </ds:schemaRefs>

</xml_diff>